<commit_message>
Rellenar la plantilla con la experiencia del CV.
Sustituye el borrador del proyecto por Bluetab, Inetum, EVO Payments y la ingeniería del Tecnológico de Tijuana.

Co-authored-by: alexandro1021 <alexandro1021@users.noreply.github.com>
</commit_message>
<xml_diff>
--- a/CV-Alexandro-Garcia.docx
+++ b/CV-Alexandro-Garcia.docx
@@ -22,7 +22,7 @@
           <w:sz w:val="46"/>
           <w:szCs w:val="46"/>
         </w:rPr>
-        <w:t>Alexandro García</w:t>
+        <w:t>Alexandro García Muro</w:t>
       </w:r>
       <w:r>
         <w:rPr>
@@ -40,7 +40,7 @@
           <w:sz w:val="24"/>
           <w:szCs w:val="24"/>
         </w:rPr>
-        <w:t>Backend Java</w:t>
+        <w:t>Ingeniero de datos</w:t>
       </w:r>
     </w:p>
     <w:p>
@@ -61,14 +61,14 @@
           <w:sz w:val="22"/>
           <w:szCs w:val="22"/>
         </w:rPr>
-        <w:t>Desarrollador backend Java. El proyecto documentado es un middleware REST sobre la API de TV Maze, con Java 21, Spring Boot 4 y MongoDB: caché de shows, comentarios con calificación y pruebas automatizadas en GitHub Actions.</w:t>
+        <w:t>Ingeniero de datos con 8 años de experiencia en integración de datos, ETL y backend. Lideró cuentas en Bluetab para Grupo AXO, EdenRed y Toyota, con Java, APIs REST, Pentaho, Python y cloud en Azure y AWS. Antes diseñó y operó los ETL de pagos con tarjeta en EVO Payments. En los roles de liderazgo trabajó con Scrum.</w:t>
       </w:r>
     </w:p>
     <w:p>
       <w:pPr>
         <w:spacing w:before="120"/>
         <w:ind w:left="-624" w:right="-429"/>
-        <w:jc w:val="both"/>
+        <w:jc w:val="left"/>
         <w:rPr>
           <w:rFonts w:ascii="Plus Jakarta Sans" w:eastAsia="Plus Jakarta Sans" w:hAnsi="Plus Jakarta Sans" w:cs="Plus Jakarta Sans"/>
           <w:color w:val="231D22"/>
@@ -83,7 +83,25 @@
           <w:sz w:val="22"/>
           <w:szCs w:val="22"/>
         </w:rPr>
-        <w:t>alexandro.garcia.mrs@gmail.com  ·  github.com/alexandro1021</w:t>
+        <w:t xml:space="preserve">+52 55 4927 7555 · alexandro.garcia.mrs@gmail.com</w:t>
+      </w:r>
+      <w:r>
+        <w:rPr>
+          <w:rFonts w:ascii="Plus Jakarta Sans" w:hAnsi="Plus Jakarta Sans" w:cs="Plus Jakarta Sans" w:eastAsia="Plus Jakarta Sans"/>
+          <w:color w:val="231D22"/>
+          <w:sz w:val="22"/>
+          <w:szCs w:val="22"/>
+        </w:rPr>
+        <w:br/>
+      </w:r>
+      <w:r>
+        <w:rPr>
+          <w:rFonts w:ascii="Plus Jakarta Sans" w:hAnsi="Plus Jakarta Sans" w:cs="Plus Jakarta Sans" w:eastAsia="Plus Jakarta Sans"/>
+          <w:color w:val="231D22"/>
+          <w:sz w:val="22"/>
+          <w:szCs w:val="22"/>
+        </w:rPr>
+        <w:t xml:space="preserve">Lerma, Estado de México · LinkedIn: Alexandro García Muro</w:t>
       </w:r>
     </w:p>
     <w:tbl>
@@ -180,7 +198,7 @@
                 <w:rFonts w:ascii="Plus Jakarta Sans" w:eastAsia="Plus Jakarta Sans" w:hAnsi="Plus Jakarta Sans" w:cs="Plus Jakarta Sans"/>
                 <w:color w:val="231D22"/>
               </w:rPr>
-              <w:t>Java 21, Spring Boot 4, MongoDB, Maven, Docker, JUnit, GitHub Actions</w:t>
+              <w:t>SQL: 8 años, Pentaho: 6 años, SQL Server: 6 años, Java: 3 años, Python: 2 años</w:t>
             </w:r>
           </w:p>
         </w:tc>
@@ -252,7 +270,7 @@
                 <w:rFonts w:ascii="Plus Jakarta Sans" w:eastAsia="Plus Jakarta Sans" w:hAnsi="Plus Jakarta Sans" w:cs="Plus Jakarta Sans"/>
                 <w:color w:val="231D22"/>
               </w:rPr>
-              <w:t>Desarrollador Backend Java</w:t>
+              <w:t>Líder técnico / Ingeniero de datos</w:t>
             </w:r>
           </w:p>
         </w:tc>
@@ -326,7 +344,7 @@
                 <w:rFonts w:ascii="Plus Jakarta Sans" w:eastAsia="Plus Jakarta Sans" w:hAnsi="Plus Jakarta Sans" w:cs="Plus Jakarta Sans"/>
                 <w:color w:val="231D22"/>
               </w:rPr>
-              <w:t>Proyecto técnico en 2026</w:t>
+              <w:t>8 años</w:t>
             </w:r>
           </w:p>
         </w:tc>
@@ -404,7 +422,7 @@
                 <w:rFonts w:ascii="Plus Jakarta Sans" w:eastAsia="Plus Jakarta Sans" w:hAnsi="Plus Jakarta Sans" w:cs="Plus Jakarta Sans"/>
                 <w:color w:val="231D22"/>
               </w:rPr>
-              <w:t xml:space="preserve">APIs REST, integración HTTP, caché, persistencia en MongoDB, validación, pruebas unitarias y de integración, CI</w:t>
+              <w:t xml:space="preserve">APIs REST, microservicios, ETL, arquitectura Medallion, Azure Data Factory, Databricks, PySpark, Synapse, AWS, Spring, Scrum</w:t>
             </w:r>
             <w:proofErr w:type="spellStart"/>
             <w:proofErr w:type="gramStart"/>
@@ -680,7 +698,7 @@
           <w:sz w:val="16"/>
           <w:szCs w:val="16"/>
         </w:rPr>
-        <w:t xml:space="preserve">2026</w:t>
+        <w:t xml:space="preserve">10/2024 - 02/2026</w:t>
       </w:r>
     </w:p>
     <w:p>
@@ -706,7 +724,7 @@
           <w:sz w:val="22"/>
           <w:szCs w:val="22"/>
         </w:rPr>
-        <w:t xml:space="preserve">Desarrollador Backend Java </w:t>
+        <w:t xml:space="preserve">Líder Técnico </w:t>
       </w:r>
       <w:r>
         <w:rPr>
@@ -739,7 +757,7 @@
           <w:sz w:val="22"/>
           <w:szCs w:val="22"/>
         </w:rPr>
-        <w:t>Proyecto propio</w:t>
+        <w:t>Bluetab</w:t>
       </w:r>
     </w:p>
     <w:p>
@@ -752,10 +770,26 @@
           <w:b/>
           <w:bCs/>
           <w:color w:val="575756"/>
-          <w:sz w:val="22"/>
-          <w:szCs w:val="22"/>
-        </w:rPr>
-      </w:pPr>
+        </w:rPr>
+      </w:pPr>
+      <w:r>
+        <w:rPr>
+          <w:rFonts w:ascii="Plus Jakarta Sans" w:eastAsia="Plus Jakarta Sans" w:hAnsi="Plus Jakarta Sans" w:cs="Plus Jakarta Sans"/>
+          <w:b/>
+          <w:bCs/>
+          <w:color w:val="231D22"/>
+        </w:rPr>
+        <w:t>Proyecto:</w:t>
+      </w:r>
+      <w:r>
+        <w:rPr>
+          <w:rFonts w:ascii="Plus Jakarta Sans" w:eastAsia="Plus Jakarta Sans" w:hAnsi="Plus Jakarta Sans" w:cs="Plus Jakarta Sans"/>
+          <w:b/>
+          <w:bCs/>
+          <w:color w:val="575756"/>
+        </w:rPr>
+        <w:t xml:space="preserve"> Cuenta Grupo AXO. APIs, microservicios e integración de datos.</w:t>
+      </w:r>
     </w:p>
     <w:p>
       <w:pPr>
@@ -764,28 +798,142 @@
         <w:ind w:left="-708" w:right="-854"/>
         <w:rPr>
           <w:rFonts w:ascii="Plus Jakarta Sans" w:eastAsia="Plus Jakarta Sans" w:hAnsi="Plus Jakarta Sans" w:cs="Plus Jakarta Sans"/>
-          <w:b/>
-          <w:bCs/>
-          <w:color w:val="575756"/>
-        </w:rPr>
-      </w:pPr>
-      <w:r>
-        <w:rPr>
-          <w:rFonts w:ascii="Plus Jakarta Sans" w:eastAsia="Plus Jakarta Sans" w:hAnsi="Plus Jakarta Sans" w:cs="Plus Jakarta Sans"/>
-          <w:b/>
-          <w:bCs/>
-          <w:color w:val="231D22"/>
-        </w:rPr>
-        <w:t>Proyecto:</w:t>
-      </w:r>
-      <w:r>
-        <w:rPr>
-          <w:rFonts w:ascii="Plus Jakarta Sans" w:eastAsia="Plus Jakarta Sans" w:hAnsi="Plus Jakarta Sans" w:cs="Plus Jakarta Sans"/>
-          <w:b/>
-          <w:bCs/>
-          <w:color w:val="575756"/>
-        </w:rPr>
-        <w:t xml:space="preserve"> Middleware TV Maze. API REST que intermedia la API pública de TV Maze.</w:t>
+          <w:color w:val="231D22"/>
+        </w:rPr>
+      </w:pPr>
+      <w:r>
+        <w:rPr>
+          <w:rFonts w:ascii="Plus Jakarta Sans" w:eastAsia="Plus Jakarta Sans" w:hAnsi="Plus Jakarta Sans" w:cs="Plus Jakarta Sans"/>
+          <w:b/>
+          <w:bCs/>
+          <w:color w:val="231D22"/>
+        </w:rPr>
+        <w:t>Tareas:</w:t>
+      </w:r>
+    </w:p>
+    <w:p>
+      <w:pPr>
+        <w:widowControl w:val="0"/>
+        <w:numPr>
+          <w:ilvl w:val="0"/>
+          <w:numId w:val="1"/>
+        </w:numPr>
+        <w:spacing w:before="120" w:line="240" w:lineRule="auto"/>
+        <w:ind w:right="-740"/>
+        <w:jc w:val="both"/>
+        <w:rPr>
+          <w:rFonts w:ascii="Plus Jakarta Sans" w:eastAsia="Plus Jakarta Sans" w:hAnsi="Plus Jakarta Sans" w:cs="Plus Jakarta Sans"/>
+          <w:color w:val="FB5607"/>
+        </w:rPr>
+      </w:pPr>
+      <w:r>
+        <w:rPr>
+          <w:rFonts w:ascii="Plus Jakarta Sans" w:hAnsi="Plus Jakarta Sans" w:cs="Plus Jakarta Sans" w:eastAsia="Plus Jakarta Sans"/>
+          <w:color w:val="231D22"/>
+          <w:sz w:val="22"/>
+          <w:szCs w:val="22"/>
+        </w:rPr>
+        <w:t>Diseñar y desarrollar APIs REST y microservicios en Java para la integración y exposición de datos.</w:t>
+      </w:r>
+    </w:p>
+    <w:p>
+      <w:pPr>
+        <w:widowControl w:val="0"/>
+        <w:numPr>
+          <w:ilvl w:val="0"/>
+          <w:numId w:val="1"/>
+        </w:numPr>
+        <w:spacing w:before="120" w:line="240" w:lineRule="auto"/>
+        <w:ind w:right="-740"/>
+        <w:jc w:val="both"/>
+        <w:rPr>
+          <w:rFonts w:ascii="Plus Jakarta Sans" w:eastAsia="Plus Jakarta Sans" w:hAnsi="Plus Jakarta Sans" w:cs="Plus Jakarta Sans"/>
+          <w:color w:val="FB5607"/>
+        </w:rPr>
+      </w:pPr>
+      <w:r>
+        <w:rPr>
+          <w:rFonts w:ascii="Plus Jakarta Sans" w:hAnsi="Plus Jakarta Sans" w:cs="Plus Jakarta Sans" w:eastAsia="Plus Jakarta Sans"/>
+          <w:color w:val="231D22"/>
+          <w:sz w:val="22"/>
+          <w:szCs w:val="22"/>
+        </w:rPr>
+        <w:t>Desarrollar el backend con programación orientada a objetos, principios SOLID y patrones de diseño.</w:t>
+      </w:r>
+    </w:p>
+    <w:p>
+      <w:pPr>
+        <w:widowControl w:val="0"/>
+        <w:numPr>
+          <w:ilvl w:val="0"/>
+          <w:numId w:val="1"/>
+        </w:numPr>
+        <w:spacing w:before="120" w:line="240" w:lineRule="auto"/>
+        <w:ind w:right="-740"/>
+        <w:jc w:val="both"/>
+        <w:rPr>
+          <w:rFonts w:ascii="Plus Jakarta Sans" w:eastAsia="Plus Jakarta Sans" w:hAnsi="Plus Jakarta Sans" w:cs="Plus Jakarta Sans"/>
+          <w:color w:val="FB5607"/>
+        </w:rPr>
+      </w:pPr>
+      <w:r>
+        <w:rPr>
+          <w:rFonts w:ascii="Plus Jakarta Sans" w:hAnsi="Plus Jakarta Sans" w:cs="Plus Jakarta Sans" w:eastAsia="Plus Jakarta Sans"/>
+          <w:color w:val="231D22"/>
+          <w:sz w:val="22"/>
+          <w:szCs w:val="22"/>
+        </w:rPr>
+        <w:t>Desarrollar procesos de integración de datos con Pentaho y scripts de Python.</w:t>
+      </w:r>
+    </w:p>
+    <w:p>
+      <w:pPr>
+        <w:widowControl w:val="0"/>
+        <w:numPr>
+          <w:ilvl w:val="0"/>
+          <w:numId w:val="1"/>
+        </w:numPr>
+        <w:spacing w:before="120" w:line="240" w:lineRule="auto"/>
+        <w:ind w:right="-740"/>
+        <w:jc w:val="both"/>
+        <w:rPr>
+          <w:rFonts w:ascii="Plus Jakarta Sans" w:eastAsia="Plus Jakarta Sans" w:hAnsi="Plus Jakarta Sans" w:cs="Plus Jakarta Sans"/>
+          <w:color w:val="FB5607"/>
+        </w:rPr>
+      </w:pPr>
+      <w:r>
+        <w:rPr>
+          <w:rFonts w:ascii="Plus Jakarta Sans" w:hAnsi="Plus Jakarta Sans" w:cs="Plus Jakarta Sans" w:eastAsia="Plus Jakarta Sans"/>
+          <w:color w:val="231D22"/>
+          <w:sz w:val="22"/>
+          <w:szCs w:val="22"/>
+        </w:rPr>
+        <w:t>Diseñar componentes web de frontend y backend para consulta y operación de información.</w:t>
+      </w:r>
+    </w:p>
+    <w:p>
+      <w:pPr>
+        <w:widowControl w:val="0"/>
+        <w:numPr>
+          <w:ilvl w:val="0"/>
+          <w:numId w:val="1"/>
+        </w:numPr>
+        <w:spacing w:before="120" w:line="240" w:lineRule="auto"/>
+        <w:ind w:right="-740"/>
+        <w:jc w:val="both"/>
+        <w:rPr>
+          <w:rFonts w:ascii="Plus Jakarta Sans" w:eastAsia="Plus Jakarta Sans" w:hAnsi="Plus Jakarta Sans" w:cs="Plus Jakarta Sans"/>
+          <w:color w:val="FB5607"/>
+        </w:rPr>
+      </w:pPr>
+      <w:r>
+        <w:rPr>
+          <w:rFonts w:ascii="Plus Jakarta Sans" w:hAnsi="Plus Jakarta Sans" w:cs="Plus Jakarta Sans" w:eastAsia="Plus Jakarta Sans"/>
+          <w:color w:val="231D22"/>
+          <w:sz w:val="22"/>
+          <w:szCs w:val="22"/>
+        </w:rPr>
+        <w:t>Diseñar y optimizar modelos y estructuras en SQL Server, y el consumo de tablas SAP.</w:t>
       </w:r>
     </w:p>
     <w:p>
@@ -795,9 +943,104 @@
         <w:ind w:left="-708" w:right="-854"/>
         <w:rPr>
           <w:rFonts w:ascii="Plus Jakarta Sans" w:eastAsia="Plus Jakarta Sans" w:hAnsi="Plus Jakarta Sans" w:cs="Plus Jakarta Sans"/>
+          <w:b/>
+          <w:bCs/>
           <w:color w:val="575756"/>
         </w:rPr>
       </w:pPr>
+      <w:r>
+        <w:rPr>
+          <w:rFonts w:ascii="Plus Jakarta Sans" w:eastAsia="Plus Jakarta Sans" w:hAnsi="Plus Jakarta Sans" w:cs="Plus Jakarta Sans"/>
+          <w:b/>
+          <w:bCs/>
+          <w:color w:val="231D22"/>
+        </w:rPr>
+        <w:t>Retos conseguidos:</w:t>
+      </w:r>
+      <w:r>
+        <w:rPr>
+          <w:rFonts w:ascii="Plus Jakarta Sans" w:eastAsia="Plus Jakarta Sans" w:hAnsi="Plus Jakarta Sans" w:cs="Plus Jakarta Sans"/>
+          <w:b/>
+          <w:bCs/>
+          <w:color w:val="575756"/>
+        </w:rPr>
+        <w:t xml:space="preserve"> </w:t>
+      </w:r>
+    </w:p>
+    <w:p>
+      <w:pPr>
+        <w:widowControl w:val="0"/>
+        <w:numPr>
+          <w:ilvl w:val="0"/>
+          <w:numId w:val="1"/>
+        </w:numPr>
+        <w:spacing w:before="120" w:line="240" w:lineRule="auto"/>
+        <w:ind w:right="-740"/>
+        <w:jc w:val="both"/>
+        <w:rPr>
+          <w:rFonts w:ascii="Plus Jakarta Sans" w:eastAsia="Plus Jakarta Sans" w:hAnsi="Plus Jakarta Sans" w:cs="Plus Jakarta Sans"/>
+          <w:color w:val="FB5607"/>
+        </w:rPr>
+      </w:pPr>
+      <w:r>
+        <w:rPr>
+          <w:rFonts w:ascii="Plus Jakarta Sans" w:hAnsi="Plus Jakarta Sans" w:cs="Plus Jakarta Sans" w:eastAsia="Plus Jakarta Sans"/>
+          <w:color w:val="231D22"/>
+          <w:sz w:val="22"/>
+          <w:szCs w:val="22"/>
+        </w:rPr>
+        <w:t>Definir patrones de arquitectura cloud y prácticas de integración con AWS y GCP.</w:t>
+      </w:r>
+    </w:p>
+    <w:p>
+      <w:pPr>
+        <w:widowControl w:val="0"/>
+        <w:numPr>
+          <w:ilvl w:val="0"/>
+          <w:numId w:val="1"/>
+        </w:numPr>
+        <w:spacing w:before="120" w:line="240" w:lineRule="auto"/>
+        <w:ind w:right="-740"/>
+        <w:jc w:val="both"/>
+        <w:rPr>
+          <w:rFonts w:ascii="Plus Jakarta Sans" w:eastAsia="Plus Jakarta Sans" w:hAnsi="Plus Jakarta Sans" w:cs="Plus Jakarta Sans"/>
+          <w:color w:val="FB5607"/>
+        </w:rPr>
+      </w:pPr>
+      <w:r>
+        <w:rPr>
+          <w:rFonts w:ascii="Plus Jakarta Sans" w:hAnsi="Plus Jakarta Sans" w:cs="Plus Jakarta Sans" w:eastAsia="Plus Jakarta Sans"/>
+          <w:color w:val="231D22"/>
+          <w:sz w:val="22"/>
+          <w:szCs w:val="22"/>
+        </w:rPr>
+        <w:t>Dar de alta y orquestar en Rundeck los procesos de Pentaho y Python, con arquitectura Medallion.</w:t>
+      </w:r>
+    </w:p>
+    <w:p>
+      <w:pPr>
+        <w:widowControl w:val="0"/>
+        <w:numPr>
+          <w:ilvl w:val="0"/>
+          <w:numId w:val="1"/>
+        </w:numPr>
+        <w:spacing w:before="120" w:line="240" w:lineRule="auto"/>
+        <w:ind w:right="-740"/>
+        <w:jc w:val="both"/>
+        <w:rPr>
+          <w:rFonts w:ascii="Plus Jakarta Sans" w:eastAsia="Plus Jakarta Sans" w:hAnsi="Plus Jakarta Sans" w:cs="Plus Jakarta Sans"/>
+          <w:color w:val="FB5607"/>
+        </w:rPr>
+      </w:pPr>
+      <w:r>
+        <w:rPr>
+          <w:rFonts w:ascii="Plus Jakarta Sans" w:hAnsi="Plus Jakarta Sans" w:cs="Plus Jakarta Sans" w:eastAsia="Plus Jakarta Sans"/>
+          <w:color w:val="231D22"/>
+          <w:sz w:val="22"/>
+          <w:szCs w:val="22"/>
+        </w:rPr>
+        <w:t>Liderar al equipo: revisión de código, estimación de tareas y seguimiento de riesgos en Scrum.</w:t>
+      </w:r>
     </w:p>
     <w:p>
       <w:pPr>
@@ -806,218 +1049,6 @@
         <w:ind w:left="-708" w:right="-854"/>
         <w:rPr>
           <w:rFonts w:ascii="Plus Jakarta Sans" w:eastAsia="Plus Jakarta Sans" w:hAnsi="Plus Jakarta Sans" w:cs="Plus Jakarta Sans"/>
-          <w:color w:val="231D22"/>
-        </w:rPr>
-      </w:pPr>
-      <w:r>
-        <w:rPr>
-          <w:rFonts w:ascii="Plus Jakarta Sans" w:eastAsia="Plus Jakarta Sans" w:hAnsi="Plus Jakarta Sans" w:cs="Plus Jakarta Sans"/>
-          <w:b/>
-          <w:bCs/>
-          <w:color w:val="231D22"/>
-        </w:rPr>
-        <w:t>Tareas:</w:t>
-      </w:r>
-    </w:p>
-    <w:p>
-      <w:pPr>
-        <w:widowControl w:val="0"/>
-        <w:numPr>
-          <w:ilvl w:val="0"/>
-          <w:numId w:val="1"/>
-        </w:numPr>
-        <w:spacing w:before="120" w:line="240" w:lineRule="auto"/>
-        <w:ind w:right="-740"/>
-        <w:jc w:val="both"/>
-        <w:rPr>
-          <w:rFonts w:ascii="Plus Jakarta Sans" w:eastAsia="Plus Jakarta Sans" w:hAnsi="Plus Jakarta Sans" w:cs="Plus Jakarta Sans"/>
-          <w:color w:val="FB5607"/>
-        </w:rPr>
-      </w:pPr>
-      <w:r>
-        <w:rPr>
-          <w:rFonts w:ascii="Plus Jakarta Sans" w:hAnsi="Plus Jakarta Sans" w:cs="Plus Jakarta Sans" w:eastAsia="Plus Jakarta Sans"/>
-          <w:color w:val="231D22"/>
-          <w:sz w:val="22"/>
-          <w:szCs w:val="22"/>
-        </w:rPr>
-        <w:t>Publicar búsqueda de shows, detalle por id y alta de comentarios.</w:t>
-      </w:r>
-    </w:p>
-    <w:p>
-      <w:pPr>
-        <w:widowControl w:val="0"/>
-        <w:numPr>
-          <w:ilvl w:val="0"/>
-          <w:numId w:val="1"/>
-        </w:numPr>
-        <w:spacing w:before="120" w:line="240" w:lineRule="auto"/>
-        <w:ind w:right="-740"/>
-        <w:jc w:val="both"/>
-        <w:rPr>
-          <w:rFonts w:ascii="Plus Jakarta Sans" w:eastAsia="Plus Jakarta Sans" w:hAnsi="Plus Jakarta Sans" w:cs="Plus Jakarta Sans"/>
-          <w:color w:val="FB5607"/>
-        </w:rPr>
-      </w:pPr>
-      <w:r>
-        <w:rPr>
-          <w:rFonts w:ascii="Plus Jakarta Sans" w:hAnsi="Plus Jakarta Sans" w:cs="Plus Jakarta Sans" w:eastAsia="Plus Jakarta Sans"/>
-          <w:color w:val="231D22"/>
-          <w:sz w:val="22"/>
-          <w:szCs w:val="22"/>
-        </w:rPr>
-        <w:t>Guardar el show en MongoDB la primera vez que se consulta y reutilizar esa copia después. Un 404 de TV Maze no se cachea.</w:t>
-      </w:r>
-    </w:p>
-    <w:p>
-      <w:pPr>
-        <w:widowControl w:val="0"/>
-        <w:numPr>
-          <w:ilvl w:val="0"/>
-          <w:numId w:val="1"/>
-        </w:numPr>
-        <w:spacing w:before="120" w:line="240" w:lineRule="auto"/>
-        <w:ind w:right="-740"/>
-        <w:jc w:val="both"/>
-        <w:rPr>
-          <w:rFonts w:ascii="Plus Jakarta Sans" w:eastAsia="Plus Jakarta Sans" w:hAnsi="Plus Jakarta Sans" w:cs="Plus Jakarta Sans"/>
-          <w:color w:val="FB5607"/>
-        </w:rPr>
-      </w:pPr>
-      <w:r>
-        <w:rPr>
-          <w:rFonts w:ascii="Plus Jakarta Sans" w:hAnsi="Plus Jakarta Sans" w:cs="Plus Jakarta Sans" w:eastAsia="Plus Jakarta Sans"/>
-          <w:color w:val="231D22"/>
-          <w:sz w:val="22"/>
-          <w:szCs w:val="22"/>
-        </w:rPr>
-        <w:t>Leer los comentarios de una colección distinta a la caché e incluirlos en la búsqueda y en el detalle.</w:t>
-      </w:r>
-    </w:p>
-    <w:p>
-      <w:pPr>
-        <w:widowControl w:val="0"/>
-        <w:numPr>
-          <w:ilvl w:val="0"/>
-          <w:numId w:val="1"/>
-        </w:numPr>
-        <w:spacing w:before="120" w:line="240" w:lineRule="auto"/>
-        <w:ind w:right="-740"/>
-        <w:jc w:val="both"/>
-        <w:rPr>
-          <w:rFonts w:ascii="Plus Jakarta Sans" w:eastAsia="Plus Jakarta Sans" w:hAnsi="Plus Jakarta Sans" w:cs="Plus Jakarta Sans"/>
-          <w:color w:val="FB5607"/>
-        </w:rPr>
-      </w:pPr>
-      <w:r>
-        <w:rPr>
-          <w:rFonts w:ascii="Plus Jakarta Sans" w:hAnsi="Plus Jakarta Sans" w:cs="Plus Jakarta Sans" w:eastAsia="Plus Jakarta Sans"/>
-          <w:color w:val="231D22"/>
-          <w:sz w:val="22"/>
-          <w:szCs w:val="22"/>
-        </w:rPr>
-        <w:t>Validar la calificación de 0 a 5, documentar la API con Swagger y exponer el health check con Actuator.</w:t>
-      </w:r>
-    </w:p>
-    <w:p>
-      <w:pPr>
-        <w:widowControl w:val="0"/>
-        <w:spacing w:after="0" w:line="240" w:lineRule="auto"/>
-        <w:ind w:left="-708" w:right="-854"/>
-        <w:rPr>
-          <w:rFonts w:ascii="Plus Jakarta Sans" w:eastAsia="Plus Jakarta Sans" w:hAnsi="Plus Jakarta Sans" w:cs="Plus Jakarta Sans"/>
-          <w:b/>
-          <w:bCs/>
-          <w:color w:val="575756"/>
-        </w:rPr>
-      </w:pPr>
-      <w:r>
-        <w:rPr>
-          <w:rFonts w:ascii="Plus Jakarta Sans" w:eastAsia="Plus Jakarta Sans" w:hAnsi="Plus Jakarta Sans" w:cs="Plus Jakarta Sans"/>
-          <w:b/>
-          <w:bCs/>
-          <w:color w:val="231D22"/>
-        </w:rPr>
-        <w:t>Retos conseguidos:</w:t>
-      </w:r>
-      <w:r>
-        <w:rPr>
-          <w:rFonts w:ascii="Plus Jakarta Sans" w:eastAsia="Plus Jakarta Sans" w:hAnsi="Plus Jakarta Sans" w:cs="Plus Jakarta Sans"/>
-          <w:b/>
-          <w:bCs/>
-          <w:color w:val="575756"/>
-        </w:rPr>
-        <w:t xml:space="preserve"> </w:t>
-      </w:r>
-    </w:p>
-    <w:p>
-      <w:pPr>
-        <w:widowControl w:val="0"/>
-        <w:numPr>
-          <w:ilvl w:val="0"/>
-          <w:numId w:val="1"/>
-        </w:numPr>
-        <w:spacing w:before="120" w:line="240" w:lineRule="auto"/>
-        <w:ind w:right="-740"/>
-        <w:jc w:val="both"/>
-        <w:rPr>
-          <w:rFonts w:ascii="Plus Jakarta Sans" w:eastAsia="Plus Jakarta Sans" w:hAnsi="Plus Jakarta Sans" w:cs="Plus Jakarta Sans"/>
-          <w:color w:val="FB5607"/>
-        </w:rPr>
-      </w:pPr>
-      <w:r>
-        <w:rPr>
-          <w:rFonts w:ascii="Plus Jakarta Sans" w:hAnsi="Plus Jakarta Sans" w:cs="Plus Jakarta Sans" w:eastAsia="Plus Jakarta Sans"/>
-          <w:color w:val="231D22"/>
-          <w:sz w:val="22"/>
-          <w:szCs w:val="22"/>
-        </w:rPr>
-        <w:t>Mantener la caché del show y los comentarios separados, para no mezclar la respuesta de TV Maze con lo que escribe el usuario.</w:t>
-      </w:r>
-    </w:p>
-    <w:p>
-      <w:pPr>
-        <w:widowControl w:val="0"/>
-        <w:numPr>
-          <w:ilvl w:val="0"/>
-          <w:numId w:val="1"/>
-        </w:numPr>
-        <w:spacing w:before="120" w:line="240" w:lineRule="auto"/>
-        <w:ind w:right="-740"/>
-        <w:jc w:val="both"/>
-        <w:rPr>
-          <w:rFonts w:ascii="Plus Jakarta Sans" w:eastAsia="Plus Jakarta Sans" w:hAnsi="Plus Jakarta Sans" w:cs="Plus Jakarta Sans"/>
-          <w:color w:val="FB5607"/>
-        </w:rPr>
-      </w:pPr>
-      <w:r>
-        <w:rPr>
-          <w:rFonts w:ascii="Plus Jakarta Sans" w:hAnsi="Plus Jakarta Sans" w:cs="Plus Jakarta Sans" w:eastAsia="Plus Jakarta Sans"/>
-          <w:color w:val="231D22"/>
-          <w:sz w:val="22"/>
-          <w:szCs w:val="22"/>
-        </w:rPr>
-        <w:t>Cubrir cliente HTTP, controladores, servicios e integración con MongoDB, con MockWebServer y un workflow de GitHub Actions sobre Mongo 8.</w:t>
-      </w:r>
-    </w:p>
-    <w:p>
-      <w:pPr>
-        <w:widowControl w:val="0"/>
-        <w:spacing w:after="0" w:line="240" w:lineRule="auto"/>
-        <w:ind w:left="-708" w:right="-854"/>
-        <w:rPr>
-          <w:rFonts w:ascii="Plus Jakarta Sans" w:eastAsia="Plus Jakarta Sans" w:hAnsi="Plus Jakarta Sans" w:cs="Plus Jakarta Sans"/>
-          <w:color w:val="575756"/>
-        </w:rPr>
-      </w:pPr>
-    </w:p>
-    <w:p>
-      <w:pPr>
-        <w:widowControl w:val="0"/>
-        <w:spacing w:after="0" w:line="240" w:lineRule="auto"/>
-        <w:ind w:left="-708" w:right="-854"/>
-        <w:rPr>
-          <w:rFonts w:ascii="Plus Jakarta Sans" w:eastAsia="Plus Jakarta Sans" w:hAnsi="Plus Jakarta Sans" w:cs="Plus Jakarta Sans"/>
           <w:b/>
           <w:bCs/>
           <w:color w:val="231D22"/>
@@ -1032,17 +1063,6 @@
         </w:rPr>
         <w:t>Metodologías, herramientas y tecnologías usadas en el proyecto:</w:t>
       </w:r>
-    </w:p>
-    <w:p>
-      <w:pPr>
-        <w:widowControl w:val="0"/>
-        <w:spacing w:after="0" w:line="240" w:lineRule="auto"/>
-        <w:ind w:left="-708" w:right="-854"/>
-        <w:rPr>
-          <w:rFonts w:ascii="Plus Jakarta Sans" w:eastAsia="Plus Jakarta Sans" w:hAnsi="Plus Jakarta Sans" w:cs="Plus Jakarta Sans"/>
-          <w:color w:val="575756"/>
-        </w:rPr>
-      </w:pPr>
     </w:p>
     <w:p>
       <w:pPr>
@@ -1064,7 +1084,7 @@
         <w:rPr>
           <w:rFonts w:ascii="Plus Jakarta Sans" w:eastAsia="Plus Jakarta Sans" w:hAnsi="Plus Jakarta Sans" w:cs="Plus Jakarta Sans"/>
         </w:rPr>
-        <w:t>Lenguajes de programación y herramientas: Java 21, Spring Boot 4 (Web, Data MongoDB, Validation, Actuator), Springdoc OpenAPI, MongoDB, Docker Compose, Maven, JUnit, MockWebServer y GitHub Actions.</w:t>
+        <w:t>Lenguajes de programación y herramientas: Java, Python, Pentaho, SQL Server, SAP, Rundeck, AWS y GCP.</w:t>
       </w:r>
     </w:p>
     <w:p>
@@ -1087,7 +1107,7 @@
         <w:rPr>
           <w:rFonts w:ascii="Plus Jakarta Sans" w:eastAsia="Plus Jakarta Sans" w:hAnsi="Plus Jakarta Sans" w:cs="Plus Jakarta Sans"/>
         </w:rPr>
-        <w:t xml:space="preserve">Metodología: capas de controlador, servicio, cliente HTTP y persistencia, con pruebas automatizadas en cada capa.</w:t>
+        <w:t xml:space="preserve">Metodología: Scrum / Agile.</w:t>
       </w:r>
     </w:p>
     <w:p>
@@ -1110,7 +1130,7 @@
         <w:rPr>
           <w:rFonts w:ascii="Plus Jakarta Sans" w:eastAsia="Plus Jakarta Sans" w:hAnsi="Plus Jakarta Sans" w:cs="Plus Jakarta Sans"/>
         </w:rPr>
-        <w:t>Principios de desarrollo y arquitecturas: cache-aside en MongoDB, separación entre la caché del show y los comentarios, validación de entrada y manejo global de errores.</w:t>
+        <w:t>Principios de desarrollo y arquitecturas: SOLID, patrones de diseño, APIs REST, microservicios y arquitectura Medallion.</w:t>
       </w:r>
     </w:p>
     <w:p>
@@ -1130,137 +1150,1837 @@
     </w:p>
     <w:p>
       <w:pPr>
-        <w:keepNext/>
+        <w:widowControl w:val="0"/>
+        <w:numPr>
+          <w:ilvl w:val="0"/>
+          <w:numId w:val="3"/>
+        </w:numPr>
+        <w:spacing w:after="0" w:line="288" w:lineRule="auto"/>
+        <w:ind w:left="-708" w:right="-854"/>
+        <w:rPr>
+          <w:rFonts w:ascii="Plus Jakarta Sans" w:eastAsia="Plus Jakarta Sans" w:hAnsi="Plus Jakarta Sans" w:cs="Plus Jakarta Sans"/>
+          <w:b/>
+          <w:bCs/>
+          <w:color w:val="FB5607"/>
+          <w:sz w:val="16"/>
+          <w:szCs w:val="16"/>
+        </w:rPr>
+      </w:pPr>
+      <w:r>
+        <w:rPr>
+          <w:rFonts w:ascii="Plus Jakarta Sans" w:eastAsia="Plus Jakarta Sans" w:hAnsi="Plus Jakarta Sans" w:cs="Plus Jakarta Sans"/>
+          <w:b/>
+          <w:bCs/>
+          <w:color w:val="BFBFBF"/>
+          <w:sz w:val="16"/>
+          <w:szCs w:val="16"/>
+        </w:rPr>
+        <w:t xml:space="preserve">02/2024 - 10/2024</w:t>
+      </w:r>
+    </w:p>
+    <w:p>
+      <w:pPr>
+        <w:widowControl w:val="0"/>
+        <w:spacing w:after="0" w:line="240" w:lineRule="auto"/>
+        <w:ind w:left="-708" w:right="-854"/>
+        <w:rPr>
+          <w:rFonts w:ascii="Plus Jakarta Sans" w:eastAsia="Plus Jakarta Sans" w:hAnsi="Plus Jakarta Sans" w:cs="Plus Jakarta Sans"/>
+          <w:b/>
+          <w:bCs/>
+          <w:color w:val="231D22"/>
+          <w:sz w:val="22"/>
+          <w:szCs w:val="22"/>
+        </w:rPr>
+      </w:pPr>
+      <w:r>
+        <w:rPr>
+          <w:rFonts w:ascii="Plus Jakarta Sans" w:eastAsia="Plus Jakarta Sans" w:hAnsi="Plus Jakarta Sans" w:cs="Plus Jakarta Sans"/>
+          <w:b/>
+          <w:bCs/>
+          <w:color w:val="231D22"/>
+          <w:sz w:val="22"/>
+          <w:szCs w:val="22"/>
+        </w:rPr>
+        <w:t xml:space="preserve">Líder Técnico </w:t>
+      </w:r>
+      <w:r>
+        <w:rPr>
+          <w:rFonts w:ascii="Plus Jakarta Sans" w:eastAsia="Plus Jakarta Sans" w:hAnsi="Plus Jakarta Sans" w:cs="Plus Jakarta Sans"/>
+          <w:b/>
+          <w:bCs/>
+          <w:color w:val="FB5607"/>
+          <w:sz w:val="16"/>
+          <w:szCs w:val="16"/>
+        </w:rPr>
+        <w:t>|</w:t>
+      </w:r>
+      <w:r>
+        <w:rPr>
+          <w:rFonts w:ascii="Plus Jakarta Sans" w:eastAsia="Plus Jakarta Sans" w:hAnsi="Plus Jakarta Sans" w:cs="Plus Jakarta Sans"/>
+          <w:b/>
+          <w:bCs/>
+          <w:color w:val="231D22"/>
+          <w:sz w:val="16"/>
+          <w:szCs w:val="16"/>
+        </w:rPr>
+        <w:t xml:space="preserve"> </w:t>
+      </w:r>
+      <w:r>
+        <w:rPr>
+          <w:rFonts w:ascii="Plus Jakarta Sans" w:eastAsia="Plus Jakarta Sans" w:hAnsi="Plus Jakarta Sans" w:cs="Plus Jakarta Sans"/>
+          <w:b/>
+          <w:bCs/>
+          <w:color w:val="231D22"/>
+          <w:sz w:val="22"/>
+          <w:szCs w:val="22"/>
+        </w:rPr>
+        <w:t>Bluetab</w:t>
+      </w:r>
+    </w:p>
+    <w:p>
+      <w:pPr>
+        <w:widowControl w:val="0"/>
+        <w:spacing w:after="0" w:line="240" w:lineRule="auto"/>
+        <w:ind w:left="-708" w:right="-854"/>
+        <w:rPr>
+          <w:rFonts w:ascii="Plus Jakarta Sans" w:eastAsia="Plus Jakarta Sans" w:hAnsi="Plus Jakarta Sans" w:cs="Plus Jakarta Sans"/>
+          <w:b/>
+          <w:bCs/>
+          <w:color w:val="575756"/>
+        </w:rPr>
+      </w:pPr>
+      <w:r>
+        <w:rPr>
+          <w:rFonts w:ascii="Plus Jakarta Sans" w:eastAsia="Plus Jakarta Sans" w:hAnsi="Plus Jakarta Sans" w:cs="Plus Jakarta Sans"/>
+          <w:b/>
+          <w:bCs/>
+          <w:color w:val="231D22"/>
+        </w:rPr>
+        <w:t>Proyecto:</w:t>
+      </w:r>
+      <w:r>
+        <w:rPr>
+          <w:rFonts w:ascii="Plus Jakarta Sans" w:eastAsia="Plus Jakarta Sans" w:hAnsi="Plus Jakarta Sans" w:cs="Plus Jakarta Sans"/>
+          <w:b/>
+          <w:bCs/>
+          <w:color w:val="575756"/>
+        </w:rPr>
+        <w:t xml:space="preserve"> Cuenta EdenRed. Migración de datos on-premise a Azure.</w:t>
+      </w:r>
+    </w:p>
+    <w:p>
+      <w:pPr>
+        <w:widowControl w:val="0"/>
+        <w:spacing w:after="0" w:line="240" w:lineRule="auto"/>
+        <w:ind w:left="-708" w:right="-854"/>
+        <w:rPr>
+          <w:rFonts w:ascii="Plus Jakarta Sans" w:eastAsia="Plus Jakarta Sans" w:hAnsi="Plus Jakarta Sans" w:cs="Plus Jakarta Sans"/>
+          <w:color w:val="231D22"/>
+        </w:rPr>
+      </w:pPr>
+      <w:r>
+        <w:rPr>
+          <w:rFonts w:ascii="Plus Jakarta Sans" w:eastAsia="Plus Jakarta Sans" w:hAnsi="Plus Jakarta Sans" w:cs="Plus Jakarta Sans"/>
+          <w:b/>
+          <w:bCs/>
+          <w:color w:val="231D22"/>
+        </w:rPr>
+        <w:t>Tareas:</w:t>
+      </w:r>
+    </w:p>
+    <w:p>
+      <w:pPr>
+        <w:widowControl w:val="0"/>
+        <w:numPr>
+          <w:ilvl w:val="0"/>
+          <w:numId w:val="1"/>
+        </w:numPr>
+        <w:spacing w:before="120" w:line="240" w:lineRule="auto"/>
+        <w:ind w:right="-740"/>
+        <w:jc w:val="both"/>
+        <w:rPr>
+          <w:rFonts w:ascii="Plus Jakarta Sans" w:eastAsia="Plus Jakarta Sans" w:hAnsi="Plus Jakarta Sans" w:cs="Plus Jakarta Sans"/>
+          <w:color w:val="FB5607"/>
+        </w:rPr>
+      </w:pPr>
+      <w:r>
+        <w:rPr>
+          <w:rFonts w:ascii="Plus Jakarta Sans" w:hAnsi="Plus Jakarta Sans" w:cs="Plus Jakarta Sans" w:eastAsia="Plus Jakarta Sans"/>
+          <w:color w:val="231D22"/>
+          <w:sz w:val="22"/>
+          <w:szCs w:val="22"/>
+        </w:rPr>
+        <w:t>Diseñar soluciones Java orientadas a APIs y microservicios para la migración de datos.</w:t>
+      </w:r>
+    </w:p>
+    <w:p>
+      <w:pPr>
+        <w:widowControl w:val="0"/>
+        <w:numPr>
+          <w:ilvl w:val="0"/>
+          <w:numId w:val="1"/>
+        </w:numPr>
+        <w:spacing w:before="120" w:line="240" w:lineRule="auto"/>
+        <w:ind w:right="-740"/>
+        <w:jc w:val="both"/>
+        <w:rPr>
+          <w:rFonts w:ascii="Plus Jakarta Sans" w:eastAsia="Plus Jakarta Sans" w:hAnsi="Plus Jakarta Sans" w:cs="Plus Jakarta Sans"/>
+          <w:color w:val="FB5607"/>
+        </w:rPr>
+      </w:pPr>
+      <w:r>
+        <w:rPr>
+          <w:rFonts w:ascii="Plus Jakarta Sans" w:hAnsi="Plus Jakarta Sans" w:cs="Plus Jakarta Sans" w:eastAsia="Plus Jakarta Sans"/>
+          <w:color w:val="231D22"/>
+          <w:sz w:val="22"/>
+          <w:szCs w:val="22"/>
+        </w:rPr>
+        <w:t>Definir planes de ingesta, componentes de integración y la documentación de la migración a Azure.</w:t>
+      </w:r>
+    </w:p>
+    <w:p>
+      <w:pPr>
+        <w:widowControl w:val="0"/>
+        <w:numPr>
+          <w:ilvl w:val="0"/>
+          <w:numId w:val="1"/>
+        </w:numPr>
+        <w:spacing w:before="120" w:line="240" w:lineRule="auto"/>
+        <w:ind w:right="-740"/>
+        <w:jc w:val="both"/>
+        <w:rPr>
+          <w:rFonts w:ascii="Plus Jakarta Sans" w:eastAsia="Plus Jakarta Sans" w:hAnsi="Plus Jakarta Sans" w:cs="Plus Jakarta Sans"/>
+          <w:color w:val="FB5607"/>
+        </w:rPr>
+      </w:pPr>
+      <w:r>
+        <w:rPr>
+          <w:rFonts w:ascii="Plus Jakarta Sans" w:hAnsi="Plus Jakarta Sans" w:cs="Plus Jakarta Sans" w:eastAsia="Plus Jakarta Sans"/>
+          <w:color w:val="231D22"/>
+          <w:sz w:val="22"/>
+          <w:szCs w:val="22"/>
+        </w:rPr>
+        <w:t>Desarrollar servicios backend y aplicaciones web con programación orientada a objetos y separación de responsabilidades.</w:t>
+      </w:r>
+    </w:p>
+    <w:p>
+      <w:pPr>
+        <w:widowControl w:val="0"/>
+        <w:numPr>
+          <w:ilvl w:val="0"/>
+          <w:numId w:val="1"/>
+        </w:numPr>
+        <w:spacing w:before="120" w:line="240" w:lineRule="auto"/>
+        <w:ind w:right="-740"/>
+        <w:jc w:val="both"/>
+        <w:rPr>
+          <w:rFonts w:ascii="Plus Jakarta Sans" w:eastAsia="Plus Jakarta Sans" w:hAnsi="Plus Jakarta Sans" w:cs="Plus Jakarta Sans"/>
+          <w:color w:val="FB5607"/>
+        </w:rPr>
+      </w:pPr>
+      <w:r>
+        <w:rPr>
+          <w:rFonts w:ascii="Plus Jakarta Sans" w:hAnsi="Plus Jakarta Sans" w:cs="Plus Jakarta Sans" w:eastAsia="Plus Jakarta Sans"/>
+          <w:color w:val="231D22"/>
+          <w:sz w:val="22"/>
+          <w:szCs w:val="22"/>
+        </w:rPr>
+        <w:t>Desarrollar réplicas desde SQL Server, Oracle y Salesforce con Azure Data Factory.</w:t>
+      </w:r>
+    </w:p>
+    <w:p>
+      <w:pPr>
+        <w:widowControl w:val="0"/>
+        <w:numPr>
+          <w:ilvl w:val="0"/>
+          <w:numId w:val="1"/>
+        </w:numPr>
+        <w:spacing w:before="120" w:line="240" w:lineRule="auto"/>
+        <w:ind w:right="-740"/>
+        <w:jc w:val="both"/>
+        <w:rPr>
+          <w:rFonts w:ascii="Plus Jakarta Sans" w:eastAsia="Plus Jakarta Sans" w:hAnsi="Plus Jakarta Sans" w:cs="Plus Jakarta Sans"/>
+          <w:color w:val="FB5607"/>
+        </w:rPr>
+      </w:pPr>
+      <w:r>
+        <w:rPr>
+          <w:rFonts w:ascii="Plus Jakarta Sans" w:hAnsi="Plus Jakarta Sans" w:cs="Plus Jakarta Sans" w:eastAsia="Plus Jakarta Sans"/>
+          <w:color w:val="231D22"/>
+          <w:sz w:val="22"/>
+          <w:szCs w:val="22"/>
+        </w:rPr>
+        <w:t>Desarrollar notebooks en Databricks con Python y PySpark sobre el Data Lake.</w:t>
+      </w:r>
+    </w:p>
+    <w:p>
+      <w:pPr>
+        <w:widowControl w:val="0"/>
+        <w:numPr>
+          <w:ilvl w:val="0"/>
+          <w:numId w:val="1"/>
+        </w:numPr>
+        <w:spacing w:before="120" w:line="240" w:lineRule="auto"/>
+        <w:ind w:right="-740"/>
+        <w:jc w:val="both"/>
+        <w:rPr>
+          <w:rFonts w:ascii="Plus Jakarta Sans" w:eastAsia="Plus Jakarta Sans" w:hAnsi="Plus Jakarta Sans" w:cs="Plus Jakarta Sans"/>
+          <w:color w:val="FB5607"/>
+        </w:rPr>
+      </w:pPr>
+      <w:r>
+        <w:rPr>
+          <w:rFonts w:ascii="Plus Jakarta Sans" w:hAnsi="Plus Jakarta Sans" w:cs="Plus Jakarta Sans" w:eastAsia="Plus Jakarta Sans"/>
+          <w:color w:val="231D22"/>
+          <w:sz w:val="22"/>
+          <w:szCs w:val="22"/>
+        </w:rPr>
+        <w:t>Diseñar bases de datos, vistas y capas de consumo en Azure Synapse.</w:t>
+      </w:r>
+    </w:p>
+    <w:p>
+      <w:pPr>
+        <w:widowControl w:val="0"/>
+        <w:spacing w:after="0" w:line="240" w:lineRule="auto"/>
+        <w:ind w:left="-708" w:right="-854"/>
+        <w:rPr>
+          <w:rFonts w:ascii="Plus Jakarta Sans" w:eastAsia="Plus Jakarta Sans" w:hAnsi="Plus Jakarta Sans" w:cs="Plus Jakarta Sans"/>
+          <w:b/>
+          <w:bCs/>
+          <w:color w:val="575756"/>
+        </w:rPr>
+      </w:pPr>
+      <w:r>
+        <w:rPr>
+          <w:rFonts w:ascii="Plus Jakarta Sans" w:eastAsia="Plus Jakarta Sans" w:hAnsi="Plus Jakarta Sans" w:cs="Plus Jakarta Sans"/>
+          <w:b/>
+          <w:bCs/>
+          <w:color w:val="231D22"/>
+        </w:rPr>
+        <w:t>Retos conseguidos:</w:t>
+      </w:r>
+      <w:r>
+        <w:rPr>
+          <w:rFonts w:ascii="Plus Jakarta Sans" w:eastAsia="Plus Jakarta Sans" w:hAnsi="Plus Jakarta Sans" w:cs="Plus Jakarta Sans"/>
+          <w:b/>
+          <w:bCs/>
+          <w:color w:val="575756"/>
+        </w:rPr>
+        <w:t xml:space="preserve"> </w:t>
+      </w:r>
+    </w:p>
+    <w:p>
+      <w:pPr>
+        <w:widowControl w:val="0"/>
+        <w:numPr>
+          <w:ilvl w:val="0"/>
+          <w:numId w:val="1"/>
+        </w:numPr>
+        <w:spacing w:before="120" w:line="240" w:lineRule="auto"/>
+        <w:ind w:right="-740"/>
+        <w:jc w:val="both"/>
+        <w:rPr>
+          <w:rFonts w:ascii="Plus Jakarta Sans" w:eastAsia="Plus Jakarta Sans" w:hAnsi="Plus Jakarta Sans" w:cs="Plus Jakarta Sans"/>
+          <w:color w:val="FB5607"/>
+        </w:rPr>
+      </w:pPr>
+      <w:r>
+        <w:rPr>
+          <w:rFonts w:ascii="Plus Jakarta Sans" w:hAnsi="Plus Jakarta Sans" w:cs="Plus Jakarta Sans" w:eastAsia="Plus Jakarta Sans"/>
+          <w:color w:val="231D22"/>
+          <w:sz w:val="22"/>
+          <w:szCs w:val="22"/>
+        </w:rPr>
+        <w:t>Migrar datos on-premise (SQL Server, Oracle y Salesforce) a Azure.</w:t>
+      </w:r>
+    </w:p>
+    <w:p>
+      <w:pPr>
+        <w:widowControl w:val="0"/>
+        <w:numPr>
+          <w:ilvl w:val="0"/>
+          <w:numId w:val="1"/>
+        </w:numPr>
+        <w:spacing w:before="120" w:line="240" w:lineRule="auto"/>
+        <w:ind w:right="-740"/>
+        <w:jc w:val="both"/>
+        <w:rPr>
+          <w:rFonts w:ascii="Plus Jakarta Sans" w:eastAsia="Plus Jakarta Sans" w:hAnsi="Plus Jakarta Sans" w:cs="Plus Jakarta Sans"/>
+          <w:color w:val="FB5607"/>
+        </w:rPr>
+      </w:pPr>
+      <w:r>
+        <w:rPr>
+          <w:rFonts w:ascii="Plus Jakarta Sans" w:hAnsi="Plus Jakarta Sans" w:cs="Plus Jakarta Sans" w:eastAsia="Plus Jakarta Sans"/>
+          <w:color w:val="231D22"/>
+          <w:sz w:val="22"/>
+          <w:szCs w:val="22"/>
+        </w:rPr>
+        <w:t>Aplicar arquitectura Medallion en el Data Lake con Databricks y PySpark.</w:t>
+      </w:r>
+    </w:p>
+    <w:p>
+      <w:pPr>
+        <w:widowControl w:val="0"/>
+        <w:numPr>
+          <w:ilvl w:val="0"/>
+          <w:numId w:val="1"/>
+        </w:numPr>
+        <w:spacing w:before="120" w:line="240" w:lineRule="auto"/>
+        <w:ind w:right="-740"/>
+        <w:jc w:val="both"/>
+        <w:rPr>
+          <w:rFonts w:ascii="Plus Jakarta Sans" w:eastAsia="Plus Jakarta Sans" w:hAnsi="Plus Jakarta Sans" w:cs="Plus Jakarta Sans"/>
+          <w:color w:val="FB5607"/>
+        </w:rPr>
+      </w:pPr>
+      <w:r>
+        <w:rPr>
+          <w:rFonts w:ascii="Plus Jakarta Sans" w:hAnsi="Plus Jakarta Sans" w:cs="Plus Jakarta Sans" w:eastAsia="Plus Jakarta Sans"/>
+          <w:color w:val="231D22"/>
+          <w:sz w:val="22"/>
+          <w:szCs w:val="22"/>
+        </w:rPr>
+        <w:t>Coordinar la planificación técnica, las dependencias y los riesgos en las ceremonias Scrum.</w:t>
+      </w:r>
+    </w:p>
+    <w:p>
+      <w:pPr>
+        <w:widowControl w:val="0"/>
+        <w:spacing w:after="0" w:line="240" w:lineRule="auto"/>
+        <w:ind w:left="-708" w:right="-854"/>
+        <w:rPr>
+          <w:rFonts w:ascii="Plus Jakarta Sans" w:eastAsia="Plus Jakarta Sans" w:hAnsi="Plus Jakarta Sans" w:cs="Plus Jakarta Sans"/>
+          <w:b/>
+          <w:bCs/>
+          <w:color w:val="231D22"/>
+        </w:rPr>
+      </w:pPr>
+      <w:r>
+        <w:rPr>
+          <w:rFonts w:ascii="Plus Jakarta Sans" w:eastAsia="Plus Jakarta Sans" w:hAnsi="Plus Jakarta Sans" w:cs="Plus Jakarta Sans"/>
+          <w:b/>
+          <w:bCs/>
+          <w:color w:val="231D22"/>
+        </w:rPr>
+        <w:t>Metodologías, herramientas y tecnologías usadas en el proyecto:</w:t>
+      </w:r>
+    </w:p>
+    <w:p>
+      <w:pPr>
         <w:keepLines/>
-        <w:spacing w:before="120" w:line="360" w:lineRule="auto"/>
-        <w:ind w:left="-620" w:right="-860"/>
-        <w:jc w:val="both"/>
-        <w:rPr>
-          <w:rFonts w:ascii="Plus Jakarta Sans" w:eastAsia="Plus Jakarta Sans" w:hAnsi="Plus Jakarta Sans" w:cs="Plus Jakarta Sans"/>
-          <w:color w:val="FB5607"/>
-        </w:rPr>
-      </w:pPr>
-      <w:bookmarkStart w:id="3" w:name="_1tpsl1l7pz55" w:colFirst="0" w:colLast="0"/>
-      <w:bookmarkEnd w:id="3"/>
-      <w:r>
-        <w:rPr>
-          <w:rFonts w:ascii="Plus Jakarta Sans" w:eastAsia="Plus Jakarta Sans" w:hAnsi="Plus Jakarta Sans" w:cs="Plus Jakarta Sans"/>
-          <w:b/>
-          <w:bCs/>
-          <w:color w:val="FB5607"/>
-        </w:rPr>
-        <w:t>CURSOS Y CERTIFICACIONES</w:t>
-      </w:r>
-      <w:r>
-        <w:rPr>
-          <w:rFonts w:ascii="Plus Jakarta Sans" w:eastAsia="Plus Jakarta Sans" w:hAnsi="Plus Jakarta Sans" w:cs="Plus Jakarta Sans"/>
-          <w:color w:val="FB5607"/>
-        </w:rPr>
-        <w:t xml:space="preserve"/>
-      </w:r>
-    </w:p>
-    <w:tbl>
-      <w:tblPr>
-        <w:tblStyle w:val="a0"/>
-        <w:tblW w:w="9705" w:type="dxa"/>
-        <w:tblInd w:w="-705" w:type="dxa"/>
-        <w:tblBorders>
-          <w:top w:val="single" w:sz="8" w:space="0" w:color="000000"/>
-          <w:left w:val="single" w:sz="8" w:space="0" w:color="000000"/>
-          <w:bottom w:val="single" w:sz="8" w:space="0" w:color="000000"/>
-          <w:right w:val="single" w:sz="8" w:space="0" w:color="000000"/>
-          <w:insideH w:val="single" w:sz="8" w:space="0" w:color="000000"/>
-          <w:insideV w:val="single" w:sz="8" w:space="0" w:color="000000"/>
-        </w:tblBorders>
-        <w:tblLayout w:type="fixed"/>
-        <w:tblLook w:val="0600" w:firstRow="0" w:lastRow="0" w:firstColumn="0" w:lastColumn="0" w:noHBand="1" w:noVBand="1"/>
-      </w:tblPr>
-      <w:tblGrid>
-        <w:gridCol w:w="2640"/>
-        <w:gridCol w:w="7065"/>
-      </w:tblGrid>
-      <w:tr>
-        <w:tc>
-          <w:tcPr>
-            <w:tcW w:w="2640" w:type="dxa"/>
-            <w:tcBorders>
-              <w:top w:val="nil"/>
-              <w:left w:val="nil"/>
-              <w:bottom w:val="nil"/>
-              <w:right w:val="nil"/>
-            </w:tcBorders>
-            <w:tcMar>
-              <w:top w:w="100" w:type="dxa"/>
-              <w:left w:w="100" w:type="dxa"/>
-              <w:bottom w:w="100" w:type="dxa"/>
-              <w:right w:w="100" w:type="dxa"/>
-            </w:tcMar>
-          </w:tcPr>
-          <w:p>
-            <w:pPr>
-              <w:widowControl w:val="0"/>
-              <w:spacing w:after="0" w:line="288" w:lineRule="auto"/>
-              <w:ind w:left="141" w:right="-854"/>
-              <w:rPr>
-                <w:rFonts w:ascii="Plus Jakarta Sans" w:eastAsia="Plus Jakarta Sans" w:hAnsi="Plus Jakarta Sans" w:cs="Plus Jakarta Sans"/>
-                <w:color w:val="231D22"/>
-              </w:rPr>
-            </w:pPr>
-            <w:r>
-              <w:rPr>
-                <w:rFonts w:ascii="Plus Jakarta Sans" w:eastAsia="Plus Jakarta Sans" w:hAnsi="Plus Jakarta Sans" w:cs="Plus Jakarta Sans"/>
-                <w:color w:val="231D22"/>
-              </w:rPr>
-              <w:t>—</w:t>
-            </w:r>
-          </w:p>
-        </w:tc>
-        <w:tc>
-          <w:tcPr>
-            <w:tcW w:w="7065" w:type="dxa"/>
-            <w:tcBorders>
-              <w:top w:val="nil"/>
-              <w:left w:val="nil"/>
-              <w:bottom w:val="nil"/>
-              <w:right w:val="nil"/>
-            </w:tcBorders>
-            <w:tcMar>
-              <w:top w:w="100" w:type="dxa"/>
-              <w:left w:w="100" w:type="dxa"/>
-              <w:bottom w:w="100" w:type="dxa"/>
-              <w:right w:w="100" w:type="dxa"/>
-            </w:tcMar>
-          </w:tcPr>
-          <w:p>
-            <w:pPr>
-              <w:widowControl w:val="0"/>
-              <w:spacing w:after="0" w:line="240" w:lineRule="auto"/>
-              <w:rPr>
-                <w:rFonts w:ascii="Plus Jakarta Sans" w:eastAsia="Plus Jakarta Sans" w:hAnsi="Plus Jakarta Sans" w:cs="Plus Jakarta Sans"/>
-                <w:color w:val="231D22"/>
-              </w:rPr>
-            </w:pPr>
-            <w:r>
-              <w:rPr>
-                <w:rFonts w:ascii="Plus Jakarta Sans" w:eastAsia="Plus Jakarta Sans" w:hAnsi="Plus Jakarta Sans" w:cs="Plus Jakarta Sans"/>
-                <w:color w:val="231D22"/>
-              </w:rPr>
-              <w:t>No se indicaron cursos ni certificaciones.</w:t>
-            </w:r>
-          </w:p>
-          <w:p>
-            <w:pPr>
-              <w:widowControl w:val="0"/>
-              <w:spacing w:after="0" w:line="240" w:lineRule="auto"/>
-              <w:rPr>
-                <w:rFonts w:ascii="Plus Jakarta Sans" w:eastAsia="Plus Jakarta Sans" w:hAnsi="Plus Jakarta Sans" w:cs="Plus Jakarta Sans"/>
-                <w:color w:val="231D22"/>
-              </w:rPr>
-            </w:pPr>
-          </w:p>
-        </w:tc>
-      </w:tr>
-    </w:tbl>
+        <w:widowControl w:val="0"/>
+        <w:numPr>
+          <w:ilvl w:val="0"/>
+          <w:numId w:val="7"/>
+        </w:numPr>
+        <w:spacing w:before="60" w:after="60" w:line="240" w:lineRule="auto"/>
+        <w:ind w:right="-860"/>
+        <w:jc w:val="both"/>
+        <w:rPr>
+          <w:rFonts w:ascii="Plus Jakarta Sans" w:eastAsia="Plus Jakarta Sans" w:hAnsi="Plus Jakarta Sans" w:cs="Plus Jakarta Sans"/>
+          <w:color w:val="FB5607"/>
+        </w:rPr>
+      </w:pPr>
+      <w:r>
+        <w:rPr>
+          <w:rFonts w:ascii="Plus Jakarta Sans" w:eastAsia="Plus Jakarta Sans" w:hAnsi="Plus Jakarta Sans" w:cs="Plus Jakarta Sans"/>
+        </w:rPr>
+        <w:t>Lenguajes de programación y herramientas: Java, APIs REST, Azure Data Factory, Databricks, PySpark, Data Lake, Azure Synapse, SQL Server, Oracle y Salesforce.</w:t>
+      </w:r>
+    </w:p>
+    <w:p>
+      <w:pPr>
+        <w:keepLines/>
+        <w:widowControl w:val="0"/>
+        <w:numPr>
+          <w:ilvl w:val="0"/>
+          <w:numId w:val="7"/>
+        </w:numPr>
+        <w:spacing w:before="60" w:after="60" w:line="240" w:lineRule="auto"/>
+        <w:ind w:right="-860"/>
+        <w:jc w:val="both"/>
+        <w:rPr>
+          <w:rFonts w:ascii="Plus Jakarta Sans" w:eastAsia="Plus Jakarta Sans" w:hAnsi="Plus Jakarta Sans" w:cs="Plus Jakarta Sans"/>
+          <w:color w:val="FB5607"/>
+        </w:rPr>
+      </w:pPr>
+      <w:r>
+        <w:rPr>
+          <w:rFonts w:ascii="Plus Jakarta Sans" w:eastAsia="Plus Jakarta Sans" w:hAnsi="Plus Jakarta Sans" w:cs="Plus Jakarta Sans"/>
+        </w:rPr>
+        <w:t xml:space="preserve">Metodología: Scrum / Agile.</w:t>
+      </w:r>
+    </w:p>
+    <w:p>
+      <w:pPr>
+        <w:keepLines/>
+        <w:widowControl w:val="0"/>
+        <w:numPr>
+          <w:ilvl w:val="0"/>
+          <w:numId w:val="7"/>
+        </w:numPr>
+        <w:spacing w:before="60" w:after="60" w:line="240" w:lineRule="auto"/>
+        <w:ind w:right="-860"/>
+        <w:jc w:val="both"/>
+        <w:rPr>
+          <w:rFonts w:ascii="Plus Jakarta Sans" w:eastAsia="Plus Jakarta Sans" w:hAnsi="Plus Jakarta Sans" w:cs="Plus Jakarta Sans"/>
+          <w:color w:val="FB5607"/>
+        </w:rPr>
+      </w:pPr>
+      <w:r>
+        <w:rPr>
+          <w:rFonts w:ascii="Plus Jakarta Sans" w:eastAsia="Plus Jakarta Sans" w:hAnsi="Plus Jakarta Sans" w:cs="Plus Jakarta Sans"/>
+        </w:rPr>
+        <w:t>Principios de desarrollo y arquitecturas: Programación orientada a objetos, separación de responsabilidades, microservicios y arquitectura Medallion.</w:t>
+      </w:r>
+    </w:p>
+    <w:p>
+      <w:pPr>
+        <w:widowControl w:val="0"/>
+        <w:spacing w:after="0" w:line="288" w:lineRule="auto"/>
+        <w:ind w:left="-708" w:right="-854"/>
+        <w:rPr>
+          <w:rFonts w:ascii="Plus Jakarta Sans" w:eastAsia="Plus Jakarta Sans" w:hAnsi="Plus Jakarta Sans" w:cs="Plus Jakarta Sans"/>
+          <w:b/>
+          <w:bCs/>
+          <w:color w:val="BFBFBF"/>
+          <w:sz w:val="16"/>
+          <w:szCs w:val="16"/>
+        </w:rPr>
+      </w:pPr>
+    </w:p>
+    <w:p>
+      <w:pPr>
+        <w:widowControl w:val="0"/>
+        <w:numPr>
+          <w:ilvl w:val="0"/>
+          <w:numId w:val="3"/>
+        </w:numPr>
+        <w:spacing w:after="0" w:line="288" w:lineRule="auto"/>
+        <w:ind w:left="-708" w:right="-854"/>
+        <w:rPr>
+          <w:rFonts w:ascii="Plus Jakarta Sans" w:eastAsia="Plus Jakarta Sans" w:hAnsi="Plus Jakarta Sans" w:cs="Plus Jakarta Sans"/>
+          <w:b/>
+          <w:bCs/>
+          <w:color w:val="FB5607"/>
+          <w:sz w:val="16"/>
+          <w:szCs w:val="16"/>
+        </w:rPr>
+      </w:pPr>
+      <w:r>
+        <w:rPr>
+          <w:rFonts w:ascii="Plus Jakarta Sans" w:eastAsia="Plus Jakarta Sans" w:hAnsi="Plus Jakarta Sans" w:cs="Plus Jakarta Sans"/>
+          <w:b/>
+          <w:bCs/>
+          <w:color w:val="BFBFBF"/>
+          <w:sz w:val="16"/>
+          <w:szCs w:val="16"/>
+        </w:rPr>
+        <w:t xml:space="preserve">11/2022 - 11/2023</w:t>
+      </w:r>
+    </w:p>
+    <w:p>
+      <w:pPr>
+        <w:widowControl w:val="0"/>
+        <w:spacing w:after="0" w:line="240" w:lineRule="auto"/>
+        <w:ind w:left="-708" w:right="-854"/>
+        <w:rPr>
+          <w:rFonts w:ascii="Plus Jakarta Sans" w:eastAsia="Plus Jakarta Sans" w:hAnsi="Plus Jakarta Sans" w:cs="Plus Jakarta Sans"/>
+          <w:b/>
+          <w:bCs/>
+          <w:color w:val="231D22"/>
+          <w:sz w:val="22"/>
+          <w:szCs w:val="22"/>
+        </w:rPr>
+      </w:pPr>
+      <w:r>
+        <w:rPr>
+          <w:rFonts w:ascii="Plus Jakarta Sans" w:eastAsia="Plus Jakarta Sans" w:hAnsi="Plus Jakarta Sans" w:cs="Plus Jakarta Sans"/>
+          <w:b/>
+          <w:bCs/>
+          <w:color w:val="231D22"/>
+          <w:sz w:val="22"/>
+          <w:szCs w:val="22"/>
+        </w:rPr>
+        <w:t xml:space="preserve">Líder Técnico </w:t>
+      </w:r>
+      <w:r>
+        <w:rPr>
+          <w:rFonts w:ascii="Plus Jakarta Sans" w:eastAsia="Plus Jakarta Sans" w:hAnsi="Plus Jakarta Sans" w:cs="Plus Jakarta Sans"/>
+          <w:b/>
+          <w:bCs/>
+          <w:color w:val="FB5607"/>
+          <w:sz w:val="16"/>
+          <w:szCs w:val="16"/>
+        </w:rPr>
+        <w:t>|</w:t>
+      </w:r>
+      <w:r>
+        <w:rPr>
+          <w:rFonts w:ascii="Plus Jakarta Sans" w:eastAsia="Plus Jakarta Sans" w:hAnsi="Plus Jakarta Sans" w:cs="Plus Jakarta Sans"/>
+          <w:b/>
+          <w:bCs/>
+          <w:color w:val="231D22"/>
+          <w:sz w:val="16"/>
+          <w:szCs w:val="16"/>
+        </w:rPr>
+        <w:t xml:space="preserve"> </w:t>
+      </w:r>
+      <w:r>
+        <w:rPr>
+          <w:rFonts w:ascii="Plus Jakarta Sans" w:eastAsia="Plus Jakarta Sans" w:hAnsi="Plus Jakarta Sans" w:cs="Plus Jakarta Sans"/>
+          <w:b/>
+          <w:bCs/>
+          <w:color w:val="231D22"/>
+          <w:sz w:val="22"/>
+          <w:szCs w:val="22"/>
+        </w:rPr>
+        <w:t>Bluetab</w:t>
+      </w:r>
+    </w:p>
+    <w:p>
+      <w:pPr>
+        <w:widowControl w:val="0"/>
+        <w:spacing w:after="0" w:line="240" w:lineRule="auto"/>
+        <w:ind w:left="-708" w:right="-854"/>
+        <w:rPr>
+          <w:rFonts w:ascii="Plus Jakarta Sans" w:eastAsia="Plus Jakarta Sans" w:hAnsi="Plus Jakarta Sans" w:cs="Plus Jakarta Sans"/>
+          <w:b/>
+          <w:bCs/>
+          <w:color w:val="575756"/>
+        </w:rPr>
+      </w:pPr>
+      <w:r>
+        <w:rPr>
+          <w:rFonts w:ascii="Plus Jakarta Sans" w:eastAsia="Plus Jakarta Sans" w:hAnsi="Plus Jakarta Sans" w:cs="Plus Jakarta Sans"/>
+          <w:b/>
+          <w:bCs/>
+          <w:color w:val="231D22"/>
+        </w:rPr>
+        <w:t>Proyecto:</w:t>
+      </w:r>
+      <w:r>
+        <w:rPr>
+          <w:rFonts w:ascii="Plus Jakarta Sans" w:eastAsia="Plus Jakarta Sans" w:hAnsi="Plus Jakarta Sans" w:cs="Plus Jakarta Sans"/>
+          <w:b/>
+          <w:bCs/>
+          <w:color w:val="575756"/>
+        </w:rPr>
+        <w:t xml:space="preserve"> Cuenta Toyota. Integración de datos y soporte de procesos ETL productivos.</w:t>
+      </w:r>
+    </w:p>
+    <w:p>
+      <w:pPr>
+        <w:widowControl w:val="0"/>
+        <w:spacing w:after="0" w:line="240" w:lineRule="auto"/>
+        <w:ind w:left="-708" w:right="-854"/>
+        <w:rPr>
+          <w:rFonts w:ascii="Plus Jakarta Sans" w:eastAsia="Plus Jakarta Sans" w:hAnsi="Plus Jakarta Sans" w:cs="Plus Jakarta Sans"/>
+          <w:color w:val="231D22"/>
+        </w:rPr>
+      </w:pPr>
+      <w:r>
+        <w:rPr>
+          <w:rFonts w:ascii="Plus Jakarta Sans" w:eastAsia="Plus Jakarta Sans" w:hAnsi="Plus Jakarta Sans" w:cs="Plus Jakarta Sans"/>
+          <w:b/>
+          <w:bCs/>
+          <w:color w:val="231D22"/>
+        </w:rPr>
+        <w:t>Tareas:</w:t>
+      </w:r>
+    </w:p>
+    <w:p>
+      <w:pPr>
+        <w:widowControl w:val="0"/>
+        <w:numPr>
+          <w:ilvl w:val="0"/>
+          <w:numId w:val="1"/>
+        </w:numPr>
+        <w:spacing w:before="120" w:line="240" w:lineRule="auto"/>
+        <w:ind w:right="-740"/>
+        <w:jc w:val="both"/>
+        <w:rPr>
+          <w:rFonts w:ascii="Plus Jakarta Sans" w:eastAsia="Plus Jakarta Sans" w:hAnsi="Plus Jakarta Sans" w:cs="Plus Jakarta Sans"/>
+          <w:color w:val="FB5607"/>
+        </w:rPr>
+      </w:pPr>
+      <w:r>
+        <w:rPr>
+          <w:rFonts w:ascii="Plus Jakarta Sans" w:hAnsi="Plus Jakarta Sans" w:cs="Plus Jakarta Sans" w:eastAsia="Plus Jakarta Sans"/>
+          <w:color w:val="231D22"/>
+          <w:sz w:val="22"/>
+          <w:szCs w:val="22"/>
+        </w:rPr>
+        <w:t>Coordinar los desarrollos de integración de datos y el soporte de los ETL productivos.</w:t>
+      </w:r>
+    </w:p>
+    <w:p>
+      <w:pPr>
+        <w:widowControl w:val="0"/>
+        <w:numPr>
+          <w:ilvl w:val="0"/>
+          <w:numId w:val="1"/>
+        </w:numPr>
+        <w:spacing w:before="120" w:line="240" w:lineRule="auto"/>
+        <w:ind w:right="-740"/>
+        <w:jc w:val="both"/>
+        <w:rPr>
+          <w:rFonts w:ascii="Plus Jakarta Sans" w:eastAsia="Plus Jakarta Sans" w:hAnsi="Plus Jakarta Sans" w:cs="Plus Jakarta Sans"/>
+          <w:color w:val="FB5607"/>
+        </w:rPr>
+      </w:pPr>
+      <w:r>
+        <w:rPr>
+          <w:rFonts w:ascii="Plus Jakarta Sans" w:hAnsi="Plus Jakarta Sans" w:cs="Plus Jakarta Sans" w:eastAsia="Plus Jakarta Sans"/>
+          <w:color w:val="231D22"/>
+          <w:sz w:val="22"/>
+          <w:szCs w:val="22"/>
+        </w:rPr>
+        <w:t>Diseñar y desarrollar APIs y microservicios Java para integrar aplicaciones y fuentes de datos.</w:t>
+      </w:r>
+    </w:p>
+    <w:p>
+      <w:pPr>
+        <w:widowControl w:val="0"/>
+        <w:numPr>
+          <w:ilvl w:val="0"/>
+          <w:numId w:val="1"/>
+        </w:numPr>
+        <w:spacing w:before="120" w:line="240" w:lineRule="auto"/>
+        <w:ind w:right="-740"/>
+        <w:jc w:val="both"/>
+        <w:rPr>
+          <w:rFonts w:ascii="Plus Jakarta Sans" w:eastAsia="Plus Jakarta Sans" w:hAnsi="Plus Jakarta Sans" w:cs="Plus Jakarta Sans"/>
+          <w:color w:val="FB5607"/>
+        </w:rPr>
+      </w:pPr>
+      <w:r>
+        <w:rPr>
+          <w:rFonts w:ascii="Plus Jakarta Sans" w:hAnsi="Plus Jakarta Sans" w:cs="Plus Jakarta Sans" w:eastAsia="Plus Jakarta Sans"/>
+          <w:color w:val="231D22"/>
+          <w:sz w:val="22"/>
+          <w:szCs w:val="22"/>
+        </w:rPr>
+        <w:t>Desarrollar procesos de integración con Pentaho y consultas SQL para informes de todas las áreas.</w:t>
+      </w:r>
+    </w:p>
+    <w:p>
+      <w:pPr>
+        <w:widowControl w:val="0"/>
+        <w:numPr>
+          <w:ilvl w:val="0"/>
+          <w:numId w:val="1"/>
+        </w:numPr>
+        <w:spacing w:before="120" w:line="240" w:lineRule="auto"/>
+        <w:ind w:right="-740"/>
+        <w:jc w:val="both"/>
+        <w:rPr>
+          <w:rFonts w:ascii="Plus Jakarta Sans" w:eastAsia="Plus Jakarta Sans" w:hAnsi="Plus Jakarta Sans" w:cs="Plus Jakarta Sans"/>
+          <w:color w:val="FB5607"/>
+        </w:rPr>
+      </w:pPr>
+      <w:r>
+        <w:rPr>
+          <w:rFonts w:ascii="Plus Jakarta Sans" w:hAnsi="Plus Jakarta Sans" w:cs="Plus Jakarta Sans" w:eastAsia="Plus Jakarta Sans"/>
+          <w:color w:val="231D22"/>
+          <w:sz w:val="22"/>
+          <w:szCs w:val="22"/>
+        </w:rPr>
+        <w:t>Diseñar módulos ETL reutilizables para alertas, manejo de errores y estandarización de procesos.</w:t>
+      </w:r>
+    </w:p>
+    <w:p>
+      <w:pPr>
+        <w:widowControl w:val="0"/>
+        <w:numPr>
+          <w:ilvl w:val="0"/>
+          <w:numId w:val="1"/>
+        </w:numPr>
+        <w:spacing w:before="120" w:line="240" w:lineRule="auto"/>
+        <w:ind w:right="-740"/>
+        <w:jc w:val="both"/>
+        <w:rPr>
+          <w:rFonts w:ascii="Plus Jakarta Sans" w:eastAsia="Plus Jakarta Sans" w:hAnsi="Plus Jakarta Sans" w:cs="Plus Jakarta Sans"/>
+          <w:color w:val="FB5607"/>
+        </w:rPr>
+      </w:pPr>
+      <w:r>
+        <w:rPr>
+          <w:rFonts w:ascii="Plus Jakarta Sans" w:hAnsi="Plus Jakarta Sans" w:cs="Plus Jakarta Sans" w:eastAsia="Plus Jakarta Sans"/>
+          <w:color w:val="231D22"/>
+          <w:sz w:val="22"/>
+          <w:szCs w:val="22"/>
+        </w:rPr>
+        <w:t>Revisar código, definir estándares técnicos, gestionar entregables y coordinar a otros consultores.</w:t>
+      </w:r>
+    </w:p>
+    <w:p>
+      <w:pPr>
+        <w:widowControl w:val="0"/>
+        <w:spacing w:after="0" w:line="240" w:lineRule="auto"/>
+        <w:ind w:left="-708" w:right="-854"/>
+        <w:rPr>
+          <w:rFonts w:ascii="Plus Jakarta Sans" w:eastAsia="Plus Jakarta Sans" w:hAnsi="Plus Jakarta Sans" w:cs="Plus Jakarta Sans"/>
+          <w:b/>
+          <w:bCs/>
+          <w:color w:val="575756"/>
+        </w:rPr>
+      </w:pPr>
+      <w:r>
+        <w:rPr>
+          <w:rFonts w:ascii="Plus Jakarta Sans" w:eastAsia="Plus Jakarta Sans" w:hAnsi="Plus Jakarta Sans" w:cs="Plus Jakarta Sans"/>
+          <w:b/>
+          <w:bCs/>
+          <w:color w:val="231D22"/>
+        </w:rPr>
+        <w:t>Retos conseguidos:</w:t>
+      </w:r>
+      <w:r>
+        <w:rPr>
+          <w:rFonts w:ascii="Plus Jakarta Sans" w:eastAsia="Plus Jakarta Sans" w:hAnsi="Plus Jakarta Sans" w:cs="Plus Jakarta Sans"/>
+          <w:b/>
+          <w:bCs/>
+          <w:color w:val="575756"/>
+        </w:rPr>
+        <w:t xml:space="preserve"> </w:t>
+      </w:r>
+    </w:p>
+    <w:p>
+      <w:pPr>
+        <w:widowControl w:val="0"/>
+        <w:numPr>
+          <w:ilvl w:val="0"/>
+          <w:numId w:val="1"/>
+        </w:numPr>
+        <w:spacing w:before="120" w:line="240" w:lineRule="auto"/>
+        <w:ind w:right="-740"/>
+        <w:jc w:val="both"/>
+        <w:rPr>
+          <w:rFonts w:ascii="Plus Jakarta Sans" w:eastAsia="Plus Jakarta Sans" w:hAnsi="Plus Jakarta Sans" w:cs="Plus Jakarta Sans"/>
+          <w:color w:val="FB5607"/>
+        </w:rPr>
+      </w:pPr>
+      <w:r>
+        <w:rPr>
+          <w:rFonts w:ascii="Plus Jakarta Sans" w:hAnsi="Plus Jakarta Sans" w:cs="Plus Jakarta Sans" w:eastAsia="Plus Jakarta Sans"/>
+          <w:color w:val="231D22"/>
+          <w:sz w:val="22"/>
+          <w:szCs w:val="22"/>
+        </w:rPr>
+        <w:t>Optimizar los procesos ETL, que no tenían buenas prácticas de desarrollo. El rendimiento mejoró un 60%.</w:t>
+      </w:r>
+    </w:p>
+    <w:p>
+      <w:pPr>
+        <w:widowControl w:val="0"/>
+        <w:numPr>
+          <w:ilvl w:val="0"/>
+          <w:numId w:val="1"/>
+        </w:numPr>
+        <w:spacing w:before="120" w:line="240" w:lineRule="auto"/>
+        <w:ind w:right="-740"/>
+        <w:jc w:val="both"/>
+        <w:rPr>
+          <w:rFonts w:ascii="Plus Jakarta Sans" w:eastAsia="Plus Jakarta Sans" w:hAnsi="Plus Jakarta Sans" w:cs="Plus Jakarta Sans"/>
+          <w:color w:val="FB5607"/>
+        </w:rPr>
+      </w:pPr>
+      <w:r>
+        <w:rPr>
+          <w:rFonts w:ascii="Plus Jakarta Sans" w:hAnsi="Plus Jakarta Sans" w:cs="Plus Jakarta Sans" w:eastAsia="Plus Jakarta Sans"/>
+          <w:color w:val="231D22"/>
+          <w:sz w:val="22"/>
+          <w:szCs w:val="22"/>
+        </w:rPr>
+        <w:t>Optimizar bases de datos, consultas y estructuras para mejorar el rendimiento y el uso de memoria del servidor.</w:t>
+      </w:r>
+    </w:p>
+    <w:p>
+      <w:pPr>
+        <w:widowControl w:val="0"/>
+        <w:spacing w:after="0" w:line="240" w:lineRule="auto"/>
+        <w:ind w:left="-708" w:right="-854"/>
+        <w:rPr>
+          <w:rFonts w:ascii="Plus Jakarta Sans" w:eastAsia="Plus Jakarta Sans" w:hAnsi="Plus Jakarta Sans" w:cs="Plus Jakarta Sans"/>
+          <w:b/>
+          <w:bCs/>
+          <w:color w:val="231D22"/>
+        </w:rPr>
+      </w:pPr>
+      <w:r>
+        <w:rPr>
+          <w:rFonts w:ascii="Plus Jakarta Sans" w:eastAsia="Plus Jakarta Sans" w:hAnsi="Plus Jakarta Sans" w:cs="Plus Jakarta Sans"/>
+          <w:b/>
+          <w:bCs/>
+          <w:color w:val="231D22"/>
+        </w:rPr>
+        <w:t>Metodologías, herramientas y tecnologías usadas en el proyecto:</w:t>
+      </w:r>
+    </w:p>
+    <w:p>
+      <w:pPr>
+        <w:keepLines/>
+        <w:widowControl w:val="0"/>
+        <w:numPr>
+          <w:ilvl w:val="0"/>
+          <w:numId w:val="7"/>
+        </w:numPr>
+        <w:spacing w:before="60" w:after="60" w:line="240" w:lineRule="auto"/>
+        <w:ind w:right="-860"/>
+        <w:jc w:val="both"/>
+        <w:rPr>
+          <w:rFonts w:ascii="Plus Jakarta Sans" w:eastAsia="Plus Jakarta Sans" w:hAnsi="Plus Jakarta Sans" w:cs="Plus Jakarta Sans"/>
+          <w:color w:val="FB5607"/>
+        </w:rPr>
+      </w:pPr>
+      <w:r>
+        <w:rPr>
+          <w:rFonts w:ascii="Plus Jakarta Sans" w:eastAsia="Plus Jakarta Sans" w:hAnsi="Plus Jakarta Sans" w:cs="Plus Jakarta Sans"/>
+        </w:rPr>
+        <w:t>Lenguajes de programación y herramientas: Java, Spring, APIs REST, microservicios, SQL, Pentaho y SQL Server.</w:t>
+      </w:r>
+    </w:p>
+    <w:p>
+      <w:pPr>
+        <w:keepLines/>
+        <w:widowControl w:val="0"/>
+        <w:numPr>
+          <w:ilvl w:val="0"/>
+          <w:numId w:val="7"/>
+        </w:numPr>
+        <w:spacing w:before="60" w:after="60" w:line="240" w:lineRule="auto"/>
+        <w:ind w:right="-860"/>
+        <w:jc w:val="both"/>
+        <w:rPr>
+          <w:rFonts w:ascii="Plus Jakarta Sans" w:eastAsia="Plus Jakarta Sans" w:hAnsi="Plus Jakarta Sans" w:cs="Plus Jakarta Sans"/>
+          <w:color w:val="FB5607"/>
+        </w:rPr>
+      </w:pPr>
+      <w:r>
+        <w:rPr>
+          <w:rFonts w:ascii="Plus Jakarta Sans" w:eastAsia="Plus Jakarta Sans" w:hAnsi="Plus Jakarta Sans" w:cs="Plus Jakarta Sans"/>
+        </w:rPr>
+        <w:t xml:space="preserve">Metodología: Scrum / Agile.</w:t>
+      </w:r>
+    </w:p>
+    <w:p>
+      <w:pPr>
+        <w:keepLines/>
+        <w:widowControl w:val="0"/>
+        <w:numPr>
+          <w:ilvl w:val="0"/>
+          <w:numId w:val="7"/>
+        </w:numPr>
+        <w:spacing w:before="60" w:after="60" w:line="240" w:lineRule="auto"/>
+        <w:ind w:right="-860"/>
+        <w:jc w:val="both"/>
+        <w:rPr>
+          <w:rFonts w:ascii="Plus Jakarta Sans" w:eastAsia="Plus Jakarta Sans" w:hAnsi="Plus Jakarta Sans" w:cs="Plus Jakarta Sans"/>
+          <w:color w:val="FB5607"/>
+        </w:rPr>
+      </w:pPr>
+      <w:r>
+        <w:rPr>
+          <w:rFonts w:ascii="Plus Jakarta Sans" w:eastAsia="Plus Jakarta Sans" w:hAnsi="Plus Jakarta Sans" w:cs="Plus Jakarta Sans"/>
+        </w:rPr>
+        <w:t>Principios de desarrollo y arquitecturas: Programación orientada a objetos, patrones de diseño, estándares técnicos y módulos ETL reutilizables.</w:t>
+      </w:r>
+    </w:p>
+    <w:p>
+      <w:pPr>
+        <w:widowControl w:val="0"/>
+        <w:spacing w:after="0" w:line="288" w:lineRule="auto"/>
+        <w:ind w:left="-708" w:right="-854"/>
+        <w:rPr>
+          <w:rFonts w:ascii="Plus Jakarta Sans" w:eastAsia="Plus Jakarta Sans" w:hAnsi="Plus Jakarta Sans" w:cs="Plus Jakarta Sans"/>
+          <w:b/>
+          <w:bCs/>
+          <w:color w:val="BFBFBF"/>
+          <w:sz w:val="16"/>
+          <w:szCs w:val="16"/>
+        </w:rPr>
+      </w:pPr>
+    </w:p>
+    <w:p>
+      <w:pPr>
+        <w:widowControl w:val="0"/>
+        <w:numPr>
+          <w:ilvl w:val="0"/>
+          <w:numId w:val="3"/>
+        </w:numPr>
+        <w:spacing w:after="0" w:line="288" w:lineRule="auto"/>
+        <w:ind w:left="-708" w:right="-854"/>
+        <w:rPr>
+          <w:rFonts w:ascii="Plus Jakarta Sans" w:eastAsia="Plus Jakarta Sans" w:hAnsi="Plus Jakarta Sans" w:cs="Plus Jakarta Sans"/>
+          <w:b/>
+          <w:bCs/>
+          <w:color w:val="FB5607"/>
+          <w:sz w:val="16"/>
+          <w:szCs w:val="16"/>
+        </w:rPr>
+      </w:pPr>
+      <w:r>
+        <w:rPr>
+          <w:rFonts w:ascii="Plus Jakarta Sans" w:eastAsia="Plus Jakarta Sans" w:hAnsi="Plus Jakarta Sans" w:cs="Plus Jakarta Sans"/>
+          <w:b/>
+          <w:bCs/>
+          <w:color w:val="BFBFBF"/>
+          <w:sz w:val="16"/>
+          <w:szCs w:val="16"/>
+        </w:rPr>
+        <w:t xml:space="preserve">06/2022 - 11/2022</w:t>
+      </w:r>
+    </w:p>
+    <w:p>
+      <w:pPr>
+        <w:widowControl w:val="0"/>
+        <w:spacing w:after="0" w:line="240" w:lineRule="auto"/>
+        <w:ind w:left="-708" w:right="-854"/>
+        <w:rPr>
+          <w:rFonts w:ascii="Plus Jakarta Sans" w:eastAsia="Plus Jakarta Sans" w:hAnsi="Plus Jakarta Sans" w:cs="Plus Jakarta Sans"/>
+          <w:b/>
+          <w:bCs/>
+          <w:color w:val="231D22"/>
+          <w:sz w:val="22"/>
+          <w:szCs w:val="22"/>
+        </w:rPr>
+      </w:pPr>
+      <w:r>
+        <w:rPr>
+          <w:rFonts w:ascii="Plus Jakarta Sans" w:eastAsia="Plus Jakarta Sans" w:hAnsi="Plus Jakarta Sans" w:cs="Plus Jakarta Sans"/>
+          <w:b/>
+          <w:bCs/>
+          <w:color w:val="231D22"/>
+          <w:sz w:val="22"/>
+          <w:szCs w:val="22"/>
+        </w:rPr>
+        <w:t xml:space="preserve">Ingeniero de datos Azure </w:t>
+      </w:r>
+      <w:r>
+        <w:rPr>
+          <w:rFonts w:ascii="Plus Jakarta Sans" w:eastAsia="Plus Jakarta Sans" w:hAnsi="Plus Jakarta Sans" w:cs="Plus Jakarta Sans"/>
+          <w:b/>
+          <w:bCs/>
+          <w:color w:val="FB5607"/>
+          <w:sz w:val="16"/>
+          <w:szCs w:val="16"/>
+        </w:rPr>
+        <w:t>|</w:t>
+      </w:r>
+      <w:r>
+        <w:rPr>
+          <w:rFonts w:ascii="Plus Jakarta Sans" w:eastAsia="Plus Jakarta Sans" w:hAnsi="Plus Jakarta Sans" w:cs="Plus Jakarta Sans"/>
+          <w:b/>
+          <w:bCs/>
+          <w:color w:val="231D22"/>
+          <w:sz w:val="16"/>
+          <w:szCs w:val="16"/>
+        </w:rPr>
+        <w:t xml:space="preserve"> </w:t>
+      </w:r>
+      <w:r>
+        <w:rPr>
+          <w:rFonts w:ascii="Plus Jakarta Sans" w:eastAsia="Plus Jakarta Sans" w:hAnsi="Plus Jakarta Sans" w:cs="Plus Jakarta Sans"/>
+          <w:b/>
+          <w:bCs/>
+          <w:color w:val="231D22"/>
+          <w:sz w:val="22"/>
+          <w:szCs w:val="22"/>
+        </w:rPr>
+        <w:t>Inetum</w:t>
+      </w:r>
+    </w:p>
+    <w:p>
+      <w:pPr>
+        <w:widowControl w:val="0"/>
+        <w:spacing w:after="0" w:line="240" w:lineRule="auto"/>
+        <w:ind w:left="-708" w:right="-854"/>
+        <w:rPr>
+          <w:rFonts w:ascii="Plus Jakarta Sans" w:eastAsia="Plus Jakarta Sans" w:hAnsi="Plus Jakarta Sans" w:cs="Plus Jakarta Sans"/>
+          <w:b/>
+          <w:bCs/>
+          <w:color w:val="575756"/>
+        </w:rPr>
+      </w:pPr>
+      <w:r>
+        <w:rPr>
+          <w:rFonts w:ascii="Plus Jakarta Sans" w:eastAsia="Plus Jakarta Sans" w:hAnsi="Plus Jakarta Sans" w:cs="Plus Jakarta Sans"/>
+          <w:b/>
+          <w:bCs/>
+          <w:color w:val="231D22"/>
+        </w:rPr>
+        <w:t>Proyecto:</w:t>
+      </w:r>
+      <w:r>
+        <w:rPr>
+          <w:rFonts w:ascii="Plus Jakarta Sans" w:eastAsia="Plus Jakarta Sans" w:hAnsi="Plus Jakarta Sans" w:cs="Plus Jakarta Sans"/>
+          <w:b/>
+          <w:bCs/>
+          <w:color w:val="575756"/>
+        </w:rPr>
+        <w:t xml:space="preserve"> Cuenta HSBC. Desarrollo y seguimiento de ETL.</w:t>
+      </w:r>
+    </w:p>
+    <w:p>
+      <w:pPr>
+        <w:widowControl w:val="0"/>
+        <w:spacing w:after="0" w:line="240" w:lineRule="auto"/>
+        <w:ind w:left="-708" w:right="-854"/>
+        <w:rPr>
+          <w:rFonts w:ascii="Plus Jakarta Sans" w:eastAsia="Plus Jakarta Sans" w:hAnsi="Plus Jakarta Sans" w:cs="Plus Jakarta Sans"/>
+          <w:color w:val="231D22"/>
+        </w:rPr>
+      </w:pPr>
+      <w:r>
+        <w:rPr>
+          <w:rFonts w:ascii="Plus Jakarta Sans" w:eastAsia="Plus Jakarta Sans" w:hAnsi="Plus Jakarta Sans" w:cs="Plus Jakarta Sans"/>
+          <w:b/>
+          <w:bCs/>
+          <w:color w:val="231D22"/>
+        </w:rPr>
+        <w:t>Tareas:</w:t>
+      </w:r>
+    </w:p>
+    <w:p>
+      <w:pPr>
+        <w:widowControl w:val="0"/>
+        <w:numPr>
+          <w:ilvl w:val="0"/>
+          <w:numId w:val="1"/>
+        </w:numPr>
+        <w:spacing w:before="120" w:line="240" w:lineRule="auto"/>
+        <w:ind w:right="-740"/>
+        <w:jc w:val="both"/>
+        <w:rPr>
+          <w:rFonts w:ascii="Plus Jakarta Sans" w:eastAsia="Plus Jakarta Sans" w:hAnsi="Plus Jakarta Sans" w:cs="Plus Jakarta Sans"/>
+          <w:color w:val="FB5607"/>
+        </w:rPr>
+      </w:pPr>
+      <w:r>
+        <w:rPr>
+          <w:rFonts w:ascii="Plus Jakarta Sans" w:hAnsi="Plus Jakarta Sans" w:cs="Plus Jakarta Sans" w:eastAsia="Plus Jakarta Sans"/>
+          <w:color w:val="231D22"/>
+          <w:sz w:val="22"/>
+          <w:szCs w:val="22"/>
+        </w:rPr>
+        <w:t>Desarrollar y dar seguimiento a los procesos ETL de la cuenta.</w:t>
+      </w:r>
+    </w:p>
+    <w:p>
+      <w:pPr>
+        <w:widowControl w:val="0"/>
+        <w:spacing w:after="0" w:line="240" w:lineRule="auto"/>
+        <w:ind w:left="-708" w:right="-854"/>
+        <w:rPr>
+          <w:rFonts w:ascii="Plus Jakarta Sans" w:eastAsia="Plus Jakarta Sans" w:hAnsi="Plus Jakarta Sans" w:cs="Plus Jakarta Sans"/>
+          <w:b/>
+          <w:bCs/>
+          <w:color w:val="575756"/>
+        </w:rPr>
+      </w:pPr>
+      <w:r>
+        <w:rPr>
+          <w:rFonts w:ascii="Plus Jakarta Sans" w:eastAsia="Plus Jakarta Sans" w:hAnsi="Plus Jakarta Sans" w:cs="Plus Jakarta Sans"/>
+          <w:b/>
+          <w:bCs/>
+          <w:color w:val="231D22"/>
+        </w:rPr>
+        <w:t>Retos conseguidos:</w:t>
+      </w:r>
+      <w:r>
+        <w:rPr>
+          <w:rFonts w:ascii="Plus Jakarta Sans" w:eastAsia="Plus Jakarta Sans" w:hAnsi="Plus Jakarta Sans" w:cs="Plus Jakarta Sans"/>
+          <w:b/>
+          <w:bCs/>
+          <w:color w:val="575756"/>
+        </w:rPr>
+        <w:t xml:space="preserve"> </w:t>
+      </w:r>
+    </w:p>
+    <w:p>
+      <w:pPr>
+        <w:widowControl w:val="0"/>
+        <w:numPr>
+          <w:ilvl w:val="0"/>
+          <w:numId w:val="1"/>
+        </w:numPr>
+        <w:spacing w:before="120" w:line="240" w:lineRule="auto"/>
+        <w:ind w:right="-740"/>
+        <w:jc w:val="both"/>
+        <w:rPr>
+          <w:rFonts w:ascii="Plus Jakarta Sans" w:eastAsia="Plus Jakarta Sans" w:hAnsi="Plus Jakarta Sans" w:cs="Plus Jakarta Sans"/>
+          <w:color w:val="FB5607"/>
+        </w:rPr>
+      </w:pPr>
+      <w:r>
+        <w:rPr>
+          <w:rFonts w:ascii="Plus Jakarta Sans" w:hAnsi="Plus Jakarta Sans" w:cs="Plus Jakarta Sans" w:eastAsia="Plus Jakarta Sans"/>
+          <w:color w:val="231D22"/>
+          <w:sz w:val="22"/>
+          <w:szCs w:val="22"/>
+        </w:rPr>
+        <w:t>Operar el seguimiento de ETL con Control-M, Teradata y shell.</w:t>
+      </w:r>
+    </w:p>
+    <w:p>
+      <w:pPr>
+        <w:widowControl w:val="0"/>
+        <w:spacing w:after="0" w:line="240" w:lineRule="auto"/>
+        <w:ind w:left="-708" w:right="-854"/>
+        <w:rPr>
+          <w:rFonts w:ascii="Plus Jakarta Sans" w:eastAsia="Plus Jakarta Sans" w:hAnsi="Plus Jakarta Sans" w:cs="Plus Jakarta Sans"/>
+          <w:b/>
+          <w:bCs/>
+          <w:color w:val="231D22"/>
+        </w:rPr>
+      </w:pPr>
+      <w:r>
+        <w:rPr>
+          <w:rFonts w:ascii="Plus Jakarta Sans" w:eastAsia="Plus Jakarta Sans" w:hAnsi="Plus Jakarta Sans" w:cs="Plus Jakarta Sans"/>
+          <w:b/>
+          <w:bCs/>
+          <w:color w:val="231D22"/>
+        </w:rPr>
+        <w:t>Metodologías, herramientas y tecnologías usadas en el proyecto:</w:t>
+      </w:r>
+    </w:p>
+    <w:p>
+      <w:pPr>
+        <w:keepLines/>
+        <w:widowControl w:val="0"/>
+        <w:numPr>
+          <w:ilvl w:val="0"/>
+          <w:numId w:val="7"/>
+        </w:numPr>
+        <w:spacing w:before="60" w:after="60" w:line="240" w:lineRule="auto"/>
+        <w:ind w:right="-860"/>
+        <w:jc w:val="both"/>
+        <w:rPr>
+          <w:rFonts w:ascii="Plus Jakarta Sans" w:eastAsia="Plus Jakarta Sans" w:hAnsi="Plus Jakarta Sans" w:cs="Plus Jakarta Sans"/>
+          <w:color w:val="FB5607"/>
+        </w:rPr>
+      </w:pPr>
+      <w:r>
+        <w:rPr>
+          <w:rFonts w:ascii="Plus Jakarta Sans" w:eastAsia="Plus Jakarta Sans" w:hAnsi="Plus Jakarta Sans" w:cs="Plus Jakarta Sans"/>
+        </w:rPr>
+        <w:t>Lenguajes de programación y herramientas: Control-M, Teradata y shell.</w:t>
+      </w:r>
+    </w:p>
+    <w:p>
+      <w:pPr>
+        <w:keepLines/>
+        <w:widowControl w:val="0"/>
+        <w:numPr>
+          <w:ilvl w:val="0"/>
+          <w:numId w:val="7"/>
+        </w:numPr>
+        <w:spacing w:before="60" w:after="60" w:line="240" w:lineRule="auto"/>
+        <w:ind w:right="-860"/>
+        <w:jc w:val="both"/>
+        <w:rPr>
+          <w:rFonts w:ascii="Plus Jakarta Sans" w:eastAsia="Plus Jakarta Sans" w:hAnsi="Plus Jakarta Sans" w:cs="Plus Jakarta Sans"/>
+          <w:color w:val="FB5607"/>
+        </w:rPr>
+      </w:pPr>
+      <w:r>
+        <w:rPr>
+          <w:rFonts w:ascii="Plus Jakarta Sans" w:eastAsia="Plus Jakarta Sans" w:hAnsi="Plus Jakarta Sans" w:cs="Plus Jakarta Sans"/>
+        </w:rPr>
+        <w:t xml:space="preserve">Metodología: Seguimiento y operación de procesos ETL.</w:t>
+      </w:r>
+    </w:p>
+    <w:p>
+      <w:pPr>
+        <w:keepLines/>
+        <w:widowControl w:val="0"/>
+        <w:numPr>
+          <w:ilvl w:val="0"/>
+          <w:numId w:val="7"/>
+        </w:numPr>
+        <w:spacing w:before="60" w:after="60" w:line="240" w:lineRule="auto"/>
+        <w:ind w:right="-860"/>
+        <w:jc w:val="both"/>
+        <w:rPr>
+          <w:rFonts w:ascii="Plus Jakarta Sans" w:eastAsia="Plus Jakarta Sans" w:hAnsi="Plus Jakarta Sans" w:cs="Plus Jakarta Sans"/>
+          <w:color w:val="FB5607"/>
+        </w:rPr>
+      </w:pPr>
+      <w:r>
+        <w:rPr>
+          <w:rFonts w:ascii="Plus Jakarta Sans" w:eastAsia="Plus Jakarta Sans" w:hAnsi="Plus Jakarta Sans" w:cs="Plus Jakarta Sans"/>
+        </w:rPr>
+        <w:t>Principios de desarrollo y arquitecturas: Operación de ETL productivos.</w:t>
+      </w:r>
+    </w:p>
+    <w:p>
+      <w:pPr>
+        <w:widowControl w:val="0"/>
+        <w:spacing w:after="0" w:line="288" w:lineRule="auto"/>
+        <w:ind w:left="-708" w:right="-854"/>
+        <w:rPr>
+          <w:rFonts w:ascii="Plus Jakarta Sans" w:eastAsia="Plus Jakarta Sans" w:hAnsi="Plus Jakarta Sans" w:cs="Plus Jakarta Sans"/>
+          <w:b/>
+          <w:bCs/>
+          <w:color w:val="BFBFBF"/>
+          <w:sz w:val="16"/>
+          <w:szCs w:val="16"/>
+        </w:rPr>
+      </w:pPr>
+    </w:p>
+    <w:p>
+      <w:pPr>
+        <w:widowControl w:val="0"/>
+        <w:numPr>
+          <w:ilvl w:val="0"/>
+          <w:numId w:val="3"/>
+        </w:numPr>
+        <w:spacing w:after="0" w:line="288" w:lineRule="auto"/>
+        <w:ind w:left="-708" w:right="-854"/>
+        <w:rPr>
+          <w:rFonts w:ascii="Plus Jakarta Sans" w:eastAsia="Plus Jakarta Sans" w:hAnsi="Plus Jakarta Sans" w:cs="Plus Jakarta Sans"/>
+          <w:b/>
+          <w:bCs/>
+          <w:color w:val="FB5607"/>
+          <w:sz w:val="16"/>
+          <w:szCs w:val="16"/>
+        </w:rPr>
+      </w:pPr>
+      <w:r>
+        <w:rPr>
+          <w:rFonts w:ascii="Plus Jakarta Sans" w:eastAsia="Plus Jakarta Sans" w:hAnsi="Plus Jakarta Sans" w:cs="Plus Jakarta Sans"/>
+          <w:b/>
+          <w:bCs/>
+          <w:color w:val="BFBFBF"/>
+          <w:sz w:val="16"/>
+          <w:szCs w:val="16"/>
+        </w:rPr>
+        <w:t xml:space="preserve">02/2018 - 06/2022</w:t>
+      </w:r>
+    </w:p>
+    <w:p>
+      <w:pPr>
+        <w:widowControl w:val="0"/>
+        <w:spacing w:after="0" w:line="240" w:lineRule="auto"/>
+        <w:ind w:left="-708" w:right="-854"/>
+        <w:rPr>
+          <w:rFonts w:ascii="Plus Jakarta Sans" w:eastAsia="Plus Jakarta Sans" w:hAnsi="Plus Jakarta Sans" w:cs="Plus Jakarta Sans"/>
+          <w:b/>
+          <w:bCs/>
+          <w:color w:val="231D22"/>
+          <w:sz w:val="22"/>
+          <w:szCs w:val="22"/>
+        </w:rPr>
+      </w:pPr>
+      <w:r>
+        <w:rPr>
+          <w:rFonts w:ascii="Plus Jakarta Sans" w:eastAsia="Plus Jakarta Sans" w:hAnsi="Plus Jakarta Sans" w:cs="Plus Jakarta Sans"/>
+          <w:b/>
+          <w:bCs/>
+          <w:color w:val="231D22"/>
+          <w:sz w:val="22"/>
+          <w:szCs w:val="22"/>
+        </w:rPr>
+        <w:t xml:space="preserve">Ingeniero de datos </w:t>
+      </w:r>
+      <w:r>
+        <w:rPr>
+          <w:rFonts w:ascii="Plus Jakarta Sans" w:eastAsia="Plus Jakarta Sans" w:hAnsi="Plus Jakarta Sans" w:cs="Plus Jakarta Sans"/>
+          <w:b/>
+          <w:bCs/>
+          <w:color w:val="FB5607"/>
+          <w:sz w:val="16"/>
+          <w:szCs w:val="16"/>
+        </w:rPr>
+        <w:t>|</w:t>
+      </w:r>
+      <w:r>
+        <w:rPr>
+          <w:rFonts w:ascii="Plus Jakarta Sans" w:eastAsia="Plus Jakarta Sans" w:hAnsi="Plus Jakarta Sans" w:cs="Plus Jakarta Sans"/>
+          <w:b/>
+          <w:bCs/>
+          <w:color w:val="231D22"/>
+          <w:sz w:val="16"/>
+          <w:szCs w:val="16"/>
+        </w:rPr>
+        <w:t xml:space="preserve"> </w:t>
+      </w:r>
+      <w:r>
+        <w:rPr>
+          <w:rFonts w:ascii="Plus Jakarta Sans" w:eastAsia="Plus Jakarta Sans" w:hAnsi="Plus Jakarta Sans" w:cs="Plus Jakarta Sans"/>
+          <w:b/>
+          <w:bCs/>
+          <w:color w:val="231D22"/>
+          <w:sz w:val="22"/>
+          <w:szCs w:val="22"/>
+        </w:rPr>
+        <w:t>EVO Payments</w:t>
+      </w:r>
+    </w:p>
+    <w:p>
+      <w:pPr>
+        <w:widowControl w:val="0"/>
+        <w:spacing w:after="0" w:line="240" w:lineRule="auto"/>
+        <w:ind w:left="-708" w:right="-854"/>
+        <w:rPr>
+          <w:rFonts w:ascii="Plus Jakarta Sans" w:eastAsia="Plus Jakarta Sans" w:hAnsi="Plus Jakarta Sans" w:cs="Plus Jakarta Sans"/>
+          <w:b/>
+          <w:bCs/>
+          <w:color w:val="575756"/>
+        </w:rPr>
+      </w:pPr>
+      <w:r>
+        <w:rPr>
+          <w:rFonts w:ascii="Plus Jakarta Sans" w:eastAsia="Plus Jakarta Sans" w:hAnsi="Plus Jakarta Sans" w:cs="Plus Jakarta Sans"/>
+          <w:b/>
+          <w:bCs/>
+          <w:color w:val="231D22"/>
+        </w:rPr>
+        <w:t>Proyecto:</w:t>
+      </w:r>
+      <w:r>
+        <w:rPr>
+          <w:rFonts w:ascii="Plus Jakarta Sans" w:eastAsia="Plus Jakarta Sans" w:hAnsi="Plus Jakarta Sans" w:cs="Plus Jakarta Sans"/>
+          <w:b/>
+          <w:bCs/>
+          <w:color w:val="575756"/>
+        </w:rPr>
+        <w:t xml:space="preserve"> ETL de pagos con tarjeta, venta de terminales y operación de preproducción y producción. Jefe de Preproducción y Producción de 2020 a 2022.</w:t>
+      </w:r>
+    </w:p>
+    <w:p>
+      <w:pPr>
+        <w:widowControl w:val="0"/>
+        <w:spacing w:after="0" w:line="240" w:lineRule="auto"/>
+        <w:ind w:left="-708" w:right="-854"/>
+        <w:rPr>
+          <w:rFonts w:ascii="Plus Jakarta Sans" w:eastAsia="Plus Jakarta Sans" w:hAnsi="Plus Jakarta Sans" w:cs="Plus Jakarta Sans"/>
+          <w:color w:val="231D22"/>
+        </w:rPr>
+      </w:pPr>
+      <w:r>
+        <w:rPr>
+          <w:rFonts w:ascii="Plus Jakarta Sans" w:eastAsia="Plus Jakarta Sans" w:hAnsi="Plus Jakarta Sans" w:cs="Plus Jakarta Sans"/>
+          <w:b/>
+          <w:bCs/>
+          <w:color w:val="231D22"/>
+        </w:rPr>
+        <w:t>Tareas:</w:t>
+      </w:r>
+    </w:p>
+    <w:p>
+      <w:pPr>
+        <w:widowControl w:val="0"/>
+        <w:numPr>
+          <w:ilvl w:val="0"/>
+          <w:numId w:val="1"/>
+        </w:numPr>
+        <w:spacing w:before="120" w:line="240" w:lineRule="auto"/>
+        <w:ind w:right="-740"/>
+        <w:jc w:val="both"/>
+        <w:rPr>
+          <w:rFonts w:ascii="Plus Jakarta Sans" w:eastAsia="Plus Jakarta Sans" w:hAnsi="Plus Jakarta Sans" w:cs="Plus Jakarta Sans"/>
+          <w:color w:val="FB5607"/>
+        </w:rPr>
+      </w:pPr>
+      <w:r>
+        <w:rPr>
+          <w:rFonts w:ascii="Plus Jakarta Sans" w:hAnsi="Plus Jakarta Sans" w:cs="Plus Jakarta Sans" w:eastAsia="Plus Jakarta Sans"/>
+          <w:color w:val="231D22"/>
+          <w:sz w:val="22"/>
+          <w:szCs w:val="22"/>
+        </w:rPr>
+        <w:t>Desarrollar el sistema de venta de terminales portátiles (tipo clip).</w:t>
+      </w:r>
+    </w:p>
+    <w:p>
+      <w:pPr>
+        <w:widowControl w:val="0"/>
+        <w:numPr>
+          <w:ilvl w:val="0"/>
+          <w:numId w:val="1"/>
+        </w:numPr>
+        <w:spacing w:before="120" w:line="240" w:lineRule="auto"/>
+        <w:ind w:right="-740"/>
+        <w:jc w:val="both"/>
+        <w:rPr>
+          <w:rFonts w:ascii="Plus Jakarta Sans" w:eastAsia="Plus Jakarta Sans" w:hAnsi="Plus Jakarta Sans" w:cs="Plus Jakarta Sans"/>
+          <w:color w:val="FB5607"/>
+        </w:rPr>
+      </w:pPr>
+      <w:r>
+        <w:rPr>
+          <w:rFonts w:ascii="Plus Jakarta Sans" w:hAnsi="Plus Jakarta Sans" w:cs="Plus Jakarta Sans" w:eastAsia="Plus Jakarta Sans"/>
+          <w:color w:val="231D22"/>
+          <w:sz w:val="22"/>
+          <w:szCs w:val="22"/>
+        </w:rPr>
+        <w:t>Desarrollar ETLs para la carga masiva diaria de pagos con tarjeta.</w:t>
+      </w:r>
+    </w:p>
+    <w:p>
+      <w:pPr>
+        <w:widowControl w:val="0"/>
+        <w:numPr>
+          <w:ilvl w:val="0"/>
+          <w:numId w:val="1"/>
+        </w:numPr>
+        <w:spacing w:before="120" w:line="240" w:lineRule="auto"/>
+        <w:ind w:right="-740"/>
+        <w:jc w:val="both"/>
+        <w:rPr>
+          <w:rFonts w:ascii="Plus Jakarta Sans" w:eastAsia="Plus Jakarta Sans" w:hAnsi="Plus Jakarta Sans" w:cs="Plus Jakarta Sans"/>
+          <w:color w:val="FB5607"/>
+        </w:rPr>
+      </w:pPr>
+      <w:r>
+        <w:rPr>
+          <w:rFonts w:ascii="Plus Jakarta Sans" w:hAnsi="Plus Jakarta Sans" w:cs="Plus Jakarta Sans" w:eastAsia="Plus Jakarta Sans"/>
+          <w:color w:val="231D22"/>
+          <w:sz w:val="22"/>
+          <w:szCs w:val="22"/>
+        </w:rPr>
+        <w:t>Instalar y configurar Pentaho Data Integration en Windows y Linux, y usar sus repositorios.</w:t>
+      </w:r>
+    </w:p>
+    <w:p>
+      <w:pPr>
+        <w:widowControl w:val="0"/>
+        <w:numPr>
+          <w:ilvl w:val="0"/>
+          <w:numId w:val="1"/>
+        </w:numPr>
+        <w:spacing w:before="120" w:line="240" w:lineRule="auto"/>
+        <w:ind w:right="-740"/>
+        <w:jc w:val="both"/>
+        <w:rPr>
+          <w:rFonts w:ascii="Plus Jakarta Sans" w:eastAsia="Plus Jakarta Sans" w:hAnsi="Plus Jakarta Sans" w:cs="Plus Jakarta Sans"/>
+          <w:color w:val="FB5607"/>
+        </w:rPr>
+      </w:pPr>
+      <w:r>
+        <w:rPr>
+          <w:rFonts w:ascii="Plus Jakarta Sans" w:hAnsi="Plus Jakarta Sans" w:cs="Plus Jakarta Sans" w:eastAsia="Plus Jakarta Sans"/>
+          <w:color w:val="231D22"/>
+          <w:sz w:val="22"/>
+          <w:szCs w:val="22"/>
+        </w:rPr>
+        <w:t>Migrar el Data Warehouse de Netezza a SQL Server.</w:t>
+      </w:r>
+    </w:p>
+    <w:p>
+      <w:pPr>
+        <w:widowControl w:val="0"/>
+        <w:numPr>
+          <w:ilvl w:val="0"/>
+          <w:numId w:val="1"/>
+        </w:numPr>
+        <w:spacing w:before="120" w:line="240" w:lineRule="auto"/>
+        <w:ind w:right="-740"/>
+        <w:jc w:val="both"/>
+        <w:rPr>
+          <w:rFonts w:ascii="Plus Jakarta Sans" w:eastAsia="Plus Jakarta Sans" w:hAnsi="Plus Jakarta Sans" w:cs="Plus Jakarta Sans"/>
+          <w:color w:val="FB5607"/>
+        </w:rPr>
+      </w:pPr>
+      <w:r>
+        <w:rPr>
+          <w:rFonts w:ascii="Plus Jakarta Sans" w:hAnsi="Plus Jakarta Sans" w:cs="Plus Jakarta Sans" w:eastAsia="Plus Jakarta Sans"/>
+          <w:color w:val="231D22"/>
+          <w:sz w:val="22"/>
+          <w:szCs w:val="22"/>
+        </w:rPr>
+        <w:t>Consumir y enviar datos a S3 con AWS y Python.</w:t>
+      </w:r>
+    </w:p>
+    <w:p>
+      <w:pPr>
+        <w:widowControl w:val="0"/>
+        <w:numPr>
+          <w:ilvl w:val="0"/>
+          <w:numId w:val="1"/>
+        </w:numPr>
+        <w:spacing w:before="120" w:line="240" w:lineRule="auto"/>
+        <w:ind w:right="-740"/>
+        <w:jc w:val="both"/>
+        <w:rPr>
+          <w:rFonts w:ascii="Plus Jakarta Sans" w:eastAsia="Plus Jakarta Sans" w:hAnsi="Plus Jakarta Sans" w:cs="Plus Jakarta Sans"/>
+          <w:color w:val="FB5607"/>
+        </w:rPr>
+      </w:pPr>
+      <w:r>
+        <w:rPr>
+          <w:rFonts w:ascii="Plus Jakarta Sans" w:hAnsi="Plus Jakarta Sans" w:cs="Plus Jakarta Sans" w:eastAsia="Plus Jakarta Sans"/>
+          <w:color w:val="231D22"/>
+          <w:sz w:val="22"/>
+          <w:szCs w:val="22"/>
+        </w:rPr>
+        <w:t>Desarrollar el sistema de consulta de tarjetas en claro en tiempo real y alertas ETL por Telegram.</w:t>
+      </w:r>
+    </w:p>
+    <w:p>
+      <w:pPr>
+        <w:widowControl w:val="0"/>
+        <w:numPr>
+          <w:ilvl w:val="0"/>
+          <w:numId w:val="1"/>
+        </w:numPr>
+        <w:spacing w:before="120" w:line="240" w:lineRule="auto"/>
+        <w:ind w:right="-740"/>
+        <w:jc w:val="both"/>
+        <w:rPr>
+          <w:rFonts w:ascii="Plus Jakarta Sans" w:eastAsia="Plus Jakarta Sans" w:hAnsi="Plus Jakarta Sans" w:cs="Plus Jakarta Sans"/>
+          <w:color w:val="FB5607"/>
+        </w:rPr>
+      </w:pPr>
+      <w:r>
+        <w:rPr>
+          <w:rFonts w:ascii="Plus Jakarta Sans" w:hAnsi="Plus Jakarta Sans" w:cs="Plus Jakarta Sans" w:eastAsia="Plus Jakarta Sans"/>
+          <w:color w:val="231D22"/>
+          <w:sz w:val="22"/>
+          <w:szCs w:val="22"/>
+        </w:rPr>
+        <w:t>Administrar el servidor ETL, Netezza, Connect Direct, Tableau y Windows Server 2012.</w:t>
+      </w:r>
+    </w:p>
+    <w:p>
+      <w:pPr>
+        <w:widowControl w:val="0"/>
+        <w:numPr>
+          <w:ilvl w:val="0"/>
+          <w:numId w:val="1"/>
+        </w:numPr>
+        <w:spacing w:before="120" w:line="240" w:lineRule="auto"/>
+        <w:ind w:right="-740"/>
+        <w:jc w:val="both"/>
+        <w:rPr>
+          <w:rFonts w:ascii="Plus Jakarta Sans" w:eastAsia="Plus Jakarta Sans" w:hAnsi="Plus Jakarta Sans" w:cs="Plus Jakarta Sans"/>
+          <w:color w:val="FB5607"/>
+        </w:rPr>
+      </w:pPr>
+      <w:r>
+        <w:rPr>
+          <w:rFonts w:ascii="Plus Jakarta Sans" w:hAnsi="Plus Jakarta Sans" w:cs="Plus Jakarta Sans" w:eastAsia="Plus Jakarta Sans"/>
+          <w:color w:val="231D22"/>
+          <w:sz w:val="22"/>
+          <w:szCs w:val="22"/>
+        </w:rPr>
+        <w:t>Elaborar consultas productivas para informes de todas las áreas.</w:t>
+      </w:r>
+    </w:p>
+    <w:p>
+      <w:pPr>
+        <w:widowControl w:val="0"/>
+        <w:spacing w:after="0" w:line="240" w:lineRule="auto"/>
+        <w:ind w:left="-708" w:right="-854"/>
+        <w:rPr>
+          <w:rFonts w:ascii="Plus Jakarta Sans" w:eastAsia="Plus Jakarta Sans" w:hAnsi="Plus Jakarta Sans" w:cs="Plus Jakarta Sans"/>
+          <w:b/>
+          <w:bCs/>
+          <w:color w:val="575756"/>
+        </w:rPr>
+      </w:pPr>
+      <w:r>
+        <w:rPr>
+          <w:rFonts w:ascii="Plus Jakarta Sans" w:eastAsia="Plus Jakarta Sans" w:hAnsi="Plus Jakarta Sans" w:cs="Plus Jakarta Sans"/>
+          <w:b/>
+          <w:bCs/>
+          <w:color w:val="231D22"/>
+        </w:rPr>
+        <w:t>Retos conseguidos:</w:t>
+      </w:r>
+      <w:r>
+        <w:rPr>
+          <w:rFonts w:ascii="Plus Jakarta Sans" w:eastAsia="Plus Jakarta Sans" w:hAnsi="Plus Jakarta Sans" w:cs="Plus Jakarta Sans"/>
+          <w:b/>
+          <w:bCs/>
+          <w:color w:val="575756"/>
+        </w:rPr>
+        <w:t xml:space="preserve"> </w:t>
+      </w:r>
+    </w:p>
+    <w:p>
+      <w:pPr>
+        <w:widowControl w:val="0"/>
+        <w:numPr>
+          <w:ilvl w:val="0"/>
+          <w:numId w:val="1"/>
+        </w:numPr>
+        <w:spacing w:before="120" w:line="240" w:lineRule="auto"/>
+        <w:ind w:right="-740"/>
+        <w:jc w:val="both"/>
+        <w:rPr>
+          <w:rFonts w:ascii="Plus Jakarta Sans" w:eastAsia="Plus Jakarta Sans" w:hAnsi="Plus Jakarta Sans" w:cs="Plus Jakarta Sans"/>
+          <w:color w:val="FB5607"/>
+        </w:rPr>
+      </w:pPr>
+      <w:r>
+        <w:rPr>
+          <w:rFonts w:ascii="Plus Jakarta Sans" w:hAnsi="Plus Jakarta Sans" w:cs="Plus Jakarta Sans" w:eastAsia="Plus Jakarta Sans"/>
+          <w:color w:val="231D22"/>
+          <w:sz w:val="22"/>
+          <w:szCs w:val="22"/>
+        </w:rPr>
+        <w:t>Aplicación web iAcepta para la venta de terminales punto de venta. Redujo un 70% el tiempo de registro del cliente y de la venta.</w:t>
+      </w:r>
+    </w:p>
+    <w:p>
+      <w:pPr>
+        <w:widowControl w:val="0"/>
+        <w:numPr>
+          <w:ilvl w:val="0"/>
+          <w:numId w:val="1"/>
+        </w:numPr>
+        <w:spacing w:before="120" w:line="240" w:lineRule="auto"/>
+        <w:ind w:right="-740"/>
+        <w:jc w:val="both"/>
+        <w:rPr>
+          <w:rFonts w:ascii="Plus Jakarta Sans" w:eastAsia="Plus Jakarta Sans" w:hAnsi="Plus Jakarta Sans" w:cs="Plus Jakarta Sans"/>
+          <w:color w:val="FB5607"/>
+        </w:rPr>
+      </w:pPr>
+      <w:r>
+        <w:rPr>
+          <w:rFonts w:ascii="Plus Jakarta Sans" w:hAnsi="Plus Jakarta Sans" w:cs="Plus Jakarta Sans" w:eastAsia="Plus Jakarta Sans"/>
+          <w:color w:val="231D22"/>
+          <w:sz w:val="22"/>
+          <w:szCs w:val="22"/>
+        </w:rPr>
+        <w:t>Migrar el Data Warehouse de Netezza a SQL Server.</w:t>
+      </w:r>
+    </w:p>
+    <w:p>
+      <w:pPr>
+        <w:widowControl w:val="0"/>
+        <w:numPr>
+          <w:ilvl w:val="0"/>
+          <w:numId w:val="1"/>
+        </w:numPr>
+        <w:spacing w:before="120" w:line="240" w:lineRule="auto"/>
+        <w:ind w:right="-740"/>
+        <w:jc w:val="both"/>
+        <w:rPr>
+          <w:rFonts w:ascii="Plus Jakarta Sans" w:eastAsia="Plus Jakarta Sans" w:hAnsi="Plus Jakarta Sans" w:cs="Plus Jakarta Sans"/>
+          <w:color w:val="FB5607"/>
+        </w:rPr>
+      </w:pPr>
+      <w:r>
+        <w:rPr>
+          <w:rFonts w:ascii="Plus Jakarta Sans" w:hAnsi="Plus Jakarta Sans" w:cs="Plus Jakarta Sans" w:eastAsia="Plus Jakarta Sans"/>
+          <w:color w:val="231D22"/>
+          <w:sz w:val="22"/>
+          <w:szCs w:val="22"/>
+        </w:rPr>
+        <w:t>Implementar ETLs y cambios de base de datos en preproducción y producción (2020-2022).</w:t>
+      </w:r>
+    </w:p>
+    <w:p>
+      <w:pPr>
+        <w:widowControl w:val="0"/>
+        <w:spacing w:after="0" w:line="240" w:lineRule="auto"/>
+        <w:ind w:left="-708" w:right="-854"/>
+        <w:rPr>
+          <w:rFonts w:ascii="Plus Jakarta Sans" w:eastAsia="Plus Jakarta Sans" w:hAnsi="Plus Jakarta Sans" w:cs="Plus Jakarta Sans"/>
+          <w:b/>
+          <w:bCs/>
+          <w:color w:val="231D22"/>
+        </w:rPr>
+      </w:pPr>
+      <w:r>
+        <w:rPr>
+          <w:rFonts w:ascii="Plus Jakarta Sans" w:eastAsia="Plus Jakarta Sans" w:hAnsi="Plus Jakarta Sans" w:cs="Plus Jakarta Sans"/>
+          <w:b/>
+          <w:bCs/>
+          <w:color w:val="231D22"/>
+        </w:rPr>
+        <w:t>Metodologías, herramientas y tecnologías usadas en el proyecto:</w:t>
+      </w:r>
+    </w:p>
+    <w:p>
+      <w:pPr>
+        <w:keepLines/>
+        <w:widowControl w:val="0"/>
+        <w:numPr>
+          <w:ilvl w:val="0"/>
+          <w:numId w:val="7"/>
+        </w:numPr>
+        <w:spacing w:before="60" w:after="60" w:line="240" w:lineRule="auto"/>
+        <w:ind w:right="-860"/>
+        <w:jc w:val="both"/>
+        <w:rPr>
+          <w:rFonts w:ascii="Plus Jakarta Sans" w:eastAsia="Plus Jakarta Sans" w:hAnsi="Plus Jakarta Sans" w:cs="Plus Jakarta Sans"/>
+          <w:color w:val="FB5607"/>
+        </w:rPr>
+      </w:pPr>
+      <w:r>
+        <w:rPr>
+          <w:rFonts w:ascii="Plus Jakarta Sans" w:eastAsia="Plus Jakarta Sans" w:hAnsi="Plus Jakarta Sans" w:cs="Plus Jakarta Sans"/>
+        </w:rPr>
+        <w:t>Lenguajes de programación y herramientas: Pentaho, SQL Server, Netezza, Python, AWS S3, Tableau, Connect Direct, Telegram, shell, Windows Server y Linux.</w:t>
+      </w:r>
+    </w:p>
+    <w:p>
+      <w:pPr>
+        <w:keepLines/>
+        <w:widowControl w:val="0"/>
+        <w:numPr>
+          <w:ilvl w:val="0"/>
+          <w:numId w:val="7"/>
+        </w:numPr>
+        <w:spacing w:before="60" w:after="60" w:line="240" w:lineRule="auto"/>
+        <w:ind w:right="-860"/>
+        <w:jc w:val="both"/>
+        <w:rPr>
+          <w:rFonts w:ascii="Plus Jakarta Sans" w:eastAsia="Plus Jakarta Sans" w:hAnsi="Plus Jakarta Sans" w:cs="Plus Jakarta Sans"/>
+          <w:color w:val="FB5607"/>
+        </w:rPr>
+      </w:pPr>
+      <w:r>
+        <w:rPr>
+          <w:rFonts w:ascii="Plus Jakarta Sans" w:eastAsia="Plus Jakarta Sans" w:hAnsi="Plus Jakarta Sans" w:cs="Plus Jakarta Sans"/>
+        </w:rPr>
+        <w:t xml:space="preserve">Metodología: Desarrollo ETL y paso a preproducción y producción.</w:t>
+      </w:r>
+    </w:p>
+    <w:p>
+      <w:pPr>
+        <w:keepLines/>
+        <w:widowControl w:val="0"/>
+        <w:numPr>
+          <w:ilvl w:val="0"/>
+          <w:numId w:val="7"/>
+        </w:numPr>
+        <w:spacing w:before="60" w:after="60" w:line="240" w:lineRule="auto"/>
+        <w:ind w:right="-860"/>
+        <w:jc w:val="both"/>
+        <w:rPr>
+          <w:rFonts w:ascii="Plus Jakarta Sans" w:eastAsia="Plus Jakarta Sans" w:hAnsi="Plus Jakarta Sans" w:cs="Plus Jakarta Sans"/>
+          <w:color w:val="FB5607"/>
+        </w:rPr>
+      </w:pPr>
+      <w:r>
+        <w:rPr>
+          <w:rFonts w:ascii="Plus Jakarta Sans" w:eastAsia="Plus Jakarta Sans" w:hAnsi="Plus Jakarta Sans" w:cs="Plus Jakarta Sans"/>
+        </w:rPr>
+        <w:t>Principios de desarrollo y arquitecturas: Cargas masivas, migración de Data Warehouse y separación de ambientes de preproducción y producción.</w:t>
+      </w:r>
+    </w:p>
+    <w:p>
+      <w:pPr>
+        <w:widowControl w:val="0"/>
+        <w:spacing w:after="0" w:line="288" w:lineRule="auto"/>
+        <w:ind w:left="-708" w:right="-854"/>
+        <w:rPr>
+          <w:rFonts w:ascii="Plus Jakarta Sans" w:eastAsia="Plus Jakarta Sans" w:hAnsi="Plus Jakarta Sans" w:cs="Plus Jakarta Sans"/>
+          <w:b/>
+          <w:bCs/>
+          <w:color w:val="BFBFBF"/>
+          <w:sz w:val="16"/>
+          <w:szCs w:val="16"/>
+        </w:rPr>
+      </w:pPr>
+    </w:p>
     <w:p>
       <w:pPr>
         <w:keepNext/>
@@ -1343,7 +3063,7 @@
                 <w:rFonts w:ascii="Plus Jakarta Sans" w:eastAsia="Plus Jakarta Sans" w:hAnsi="Plus Jakarta Sans" w:cs="Plus Jakarta Sans"/>
                 <w:color w:val="231D22"/>
               </w:rPr>
-              <w:t>—</w:t>
+              <w:t>08/2010 - 08/2015</w:t>
             </w:r>
           </w:p>
         </w:tc>
@@ -1377,7 +3097,7 @@
                 <w:rFonts w:ascii="Plus Jakarta Sans" w:eastAsia="Plus Jakarta Sans" w:hAnsi="Plus Jakarta Sans" w:cs="Plus Jakarta Sans"/>
                 <w:color w:val="231D22"/>
               </w:rPr>
-              <w:t>No se indicó formación reglada.</w:t>
+              <w:t>Ingeniería en Sistemas Computacionales (Titulado) | Instituto Tecnológico de Tijuana, Tijuana, MX</w:t>
             </w:r>
           </w:p>
           <w:p>

</xml_diff>